<commit_message>
Removed unnecessary pre-reqs to run and understand the code.
</commit_message>
<xml_diff>
--- a/Projects/Automated Data Insights Generator/PRE-REQUISITES.docx
+++ b/Projects/Automated Data Insights Generator/PRE-REQUISITES.docx
@@ -2,305 +2,6 @@
 <file path=word/document.xml><?xml version="1.0" encoding="utf-8"?>
 <w:document xmlns:wpc="http://schemas.microsoft.com/office/word/2010/wordprocessingCanvas" xmlns:cx="http://schemas.microsoft.com/office/drawing/2014/chartex" xmlns:cx1="http://schemas.microsoft.com/office/drawing/2015/9/8/chartex" xmlns:cx2="http://schemas.microsoft.com/office/drawing/2015/10/21/chartex" xmlns:cx3="http://schemas.microsoft.com/office/drawing/2016/5/9/chartex" xmlns:cx4="http://schemas.microsoft.com/office/drawing/2016/5/10/chartex" xmlns:cx5="http://schemas.microsoft.com/office/drawing/2016/5/11/chartex" xmlns:cx6="http://schemas.microsoft.com/office/drawing/2016/5/12/chartex" xmlns:cx7="http://schemas.microsoft.com/office/drawing/2016/5/13/chartex" xmlns:cx8="http://schemas.microsoft.com/office/drawing/2016/5/14/chartex" xmlns:mc="http://schemas.openxmlformats.org/markup-compatibility/2006" xmlns:aink="http://schemas.microsoft.com/office/drawing/2016/ink" xmlns:am3d="http://schemas.microsoft.com/office/drawing/2017/model3d" xmlns:o="urn:schemas-microsoft-com:office:office" xmlns:oel="http://schemas.microsoft.com/office/2019/extlst" xmlns:r="http://schemas.openxmlformats.org/officeDocument/2006/relationships" xmlns:m="http://schemas.openxmlformats.org/officeDocument/2006/math" xmlns:v="urn:schemas-microsoft-com:vml" xmlns:wp14="http://schemas.microsoft.com/office/word/2010/wordprocessingDrawing" xmlns:wp="http://schemas.openxmlformats.org/drawingml/2006/wordprocessingDrawing" xmlns:w10="urn:schemas-microsoft-com:office:word" xmlns:w="http://schemas.openxmlformats.org/wordprocessingml/2006/main" xmlns:w14="http://schemas.microsoft.com/office/word/2010/wordml" xmlns:w15="http://schemas.microsoft.com/office/word/2012/wordml" xmlns:w16cex="http://schemas.microsoft.com/office/word/2018/wordml/cex" xmlns:w16cid="http://schemas.microsoft.com/office/word/2016/wordml/cid" xmlns:w16="http://schemas.microsoft.com/office/word/2018/wordml" xmlns:w16du="http://schemas.microsoft.com/office/word/2023/wordml/word16du" xmlns:w16sdtdh="http://schemas.microsoft.com/office/word/2020/wordml/sdtdatahash" xmlns:w16sdtfl="http://schemas.microsoft.com/office/word/2024/wordml/sdtformatlock" xmlns:w16se="http://schemas.microsoft.com/office/word/2015/wordml/symex" xmlns:wpg="http://schemas.microsoft.com/office/word/2010/wordprocessingGroup" xmlns:wpi="http://schemas.microsoft.com/office/word/2010/wordprocessingInk" xmlns:wne="http://schemas.microsoft.com/office/word/2006/wordml" xmlns:wps="http://schemas.microsoft.com/office/word/2010/wordprocessingShape" mc:Ignorable="w14 w15 w16se w16cid w16 w16cex w16sdtdh w16sdtfl w16du wp14">
   <w:body>
-    <w:p>
-      <w:pPr>
-        <w:pStyle w:val="Title"/>
-        <w:jc w:val="center"/>
-        <w:rPr>
-          <w:rFonts w:ascii="Proxima Nova" w:eastAsia="Proxima Nova" w:hAnsi="Proxima Nova" w:cs="Proxima Nova"/>
-          <w:b/>
-          <w:bCs/>
-        </w:rPr>
-      </w:pPr>
-      <w:bookmarkStart w:id="0" w:name="_heading=h.2wzyccf64x6a" w:colFirst="0" w:colLast="0"/>
-      <w:bookmarkEnd w:id="0"/>
-      <w:proofErr w:type="spellStart"/>
-      <w:r>
-        <w:rPr>
-          <w:rFonts w:ascii="Proxima Nova" w:eastAsia="Proxima Nova" w:hAnsi="Proxima Nova" w:cs="Proxima Nova"/>
-          <w:b/>
-          <w:bCs/>
-        </w:rPr>
-        <w:t>Mysql</w:t>
-      </w:r>
-      <w:proofErr w:type="spellEnd"/>
-      <w:r>
-        <w:rPr>
-          <w:rFonts w:ascii="Proxima Nova" w:eastAsia="Proxima Nova" w:hAnsi="Proxima Nova" w:cs="Proxima Nova"/>
-          <w:b/>
-          <w:bCs/>
-        </w:rPr>
-        <w:t xml:space="preserve"> –version</w:t>
-      </w:r>
-    </w:p>
-    <w:p>
-      <w:pPr>
-        <w:pStyle w:val="Title"/>
-        <w:jc w:val="center"/>
-        <w:rPr>
-          <w:rFonts w:ascii="Proxima Nova" w:eastAsia="Proxima Nova" w:hAnsi="Proxima Nova" w:cs="Proxima Nova"/>
-          <w:b/>
-          <w:bCs/>
-        </w:rPr>
-      </w:pPr>
-      <w:bookmarkStart w:id="1" w:name="_heading=h.k5hn015aoq0q" w:colFirst="0" w:colLast="0"/>
-      <w:bookmarkEnd w:id="1"/>
-      <w:r>
-        <w:rPr>
-          <w:rFonts w:ascii="Proxima Nova" w:eastAsia="Proxima Nova" w:hAnsi="Proxima Nova" w:cs="Proxima Nova"/>
-          <w:b/>
-          <w:bCs/>
-        </w:rPr>
-        <w:t xml:space="preserve">Automated Insights Generation </w:t>
-      </w:r>
-    </w:p>
-    <w:p>
-      <w:pPr>
-        <w:pStyle w:val="Heading1"/>
-        <w:rPr>
-          <w:rFonts w:ascii="Proxima Nova" w:eastAsia="Proxima Nova" w:hAnsi="Proxima Nova" w:cs="Proxima Nova"/>
-          <w:b/>
-          <w:bCs/>
-        </w:rPr>
-      </w:pPr>
-      <w:bookmarkStart w:id="2" w:name="_heading=h.yrvepgvjx0xg" w:colFirst="0" w:colLast="0"/>
-      <w:bookmarkEnd w:id="2"/>
-      <w:r>
-        <w:rPr>
-          <w:rFonts w:ascii="Proxima Nova" w:eastAsia="Proxima Nova" w:hAnsi="Proxima Nova" w:cs="Proxima Nova"/>
-          <w:b/>
-          <w:bCs/>
-        </w:rPr>
-        <w:t>Motivation</w:t>
-      </w:r>
-    </w:p>
-    <w:p>
-      <w:pPr>
-        <w:rPr>
-          <w:rFonts w:ascii="Proxima Nova" w:eastAsia="Proxima Nova" w:hAnsi="Proxima Nova" w:cs="Proxima Nova"/>
-          <w:sz w:val="24"/>
-          <w:szCs w:val="24"/>
-        </w:rPr>
-      </w:pPr>
-      <w:r>
-        <w:rPr>
-          <w:rFonts w:ascii="Proxima Nova" w:eastAsia="Proxima Nova" w:hAnsi="Proxima Nova" w:cs="Proxima Nova"/>
-          <w:sz w:val="24"/>
-          <w:szCs w:val="24"/>
-        </w:rPr>
-        <w:t>In today's data-driven world, the ability to extract meaningful insights from vast datasets is crucial for informed decision-making across all levels of an organization. However, this process often requires a deep understanding of complex querying languages and coding skills, which can be a significant barrier for many users. This project aims to democratize data analysis by building an intuitive, user-friendly system that empowers users to generate insights from their data using natural language inputs and provide high quality visual and textual insights based on the data provided.</w:t>
-      </w:r>
-    </w:p>
-    <w:p>
-      <w:pPr>
-        <w:pStyle w:val="Heading1"/>
-        <w:rPr>
-          <w:rFonts w:ascii="Proxima Nova" w:eastAsia="Proxima Nova" w:hAnsi="Proxima Nova" w:cs="Proxima Nova"/>
-          <w:b/>
-          <w:bCs/>
-          <w:sz w:val="36"/>
-          <w:szCs w:val="36"/>
-        </w:rPr>
-      </w:pPr>
-      <w:bookmarkStart w:id="3" w:name="_heading=h.sqnmffov65yk" w:colFirst="0" w:colLast="0"/>
-      <w:bookmarkEnd w:id="3"/>
-      <w:r>
-        <w:rPr>
-          <w:rFonts w:ascii="Proxima Nova" w:eastAsia="Proxima Nova" w:hAnsi="Proxima Nova" w:cs="Proxima Nova"/>
-        </w:rPr>
-        <w:br/>
-      </w:r>
-      <w:r>
-        <w:rPr>
-          <w:rFonts w:ascii="Proxima Nova" w:eastAsia="Proxima Nova" w:hAnsi="Proxima Nova" w:cs="Proxima Nova"/>
-          <w:b/>
-          <w:bCs/>
-          <w:sz w:val="36"/>
-          <w:szCs w:val="36"/>
-        </w:rPr>
-        <w:t>Objectives</w:t>
-      </w:r>
-    </w:p>
-    <w:p>
-      <w:pPr>
-        <w:numPr>
-          <w:ilvl w:val="0"/>
-          <w:numId w:val="6"/>
-        </w:numPr>
-        <w:rPr>
-          <w:rFonts w:ascii="Proxima Nova" w:eastAsia="Proxima Nova" w:hAnsi="Proxima Nova" w:cs="Proxima Nova"/>
-          <w:sz w:val="24"/>
-          <w:szCs w:val="24"/>
-        </w:rPr>
-      </w:pPr>
-      <w:r>
-        <w:rPr>
-          <w:rFonts w:ascii="Proxima Nova" w:eastAsia="Proxima Nova" w:hAnsi="Proxima Nova" w:cs="Proxima Nova"/>
-          <w:sz w:val="24"/>
-          <w:szCs w:val="24"/>
-        </w:rPr>
-        <w:t>Build a system which takes natural language as input and generate insights from the data for users across the board without the requirement of writing complex queries and code</w:t>
-      </w:r>
-    </w:p>
-    <w:p>
-      <w:pPr>
-        <w:numPr>
-          <w:ilvl w:val="0"/>
-          <w:numId w:val="6"/>
-        </w:numPr>
-        <w:rPr>
-          <w:rFonts w:ascii="Proxima Nova" w:eastAsia="Proxima Nova" w:hAnsi="Proxima Nova" w:cs="Proxima Nova"/>
-          <w:sz w:val="24"/>
-          <w:szCs w:val="24"/>
-        </w:rPr>
-      </w:pPr>
-      <w:r>
-        <w:rPr>
-          <w:rFonts w:ascii="Proxima Nova" w:eastAsia="Proxima Nova" w:hAnsi="Proxima Nova" w:cs="Proxima Nova"/>
-          <w:sz w:val="24"/>
-          <w:szCs w:val="24"/>
-        </w:rPr>
-        <w:t xml:space="preserve">Build the data pipeline which loads all csv files into SQL DB and utilises </w:t>
-      </w:r>
-      <w:proofErr w:type="spellStart"/>
-      <w:r>
-        <w:rPr>
-          <w:rFonts w:ascii="Proxima Nova" w:eastAsia="Proxima Nova" w:hAnsi="Proxima Nova" w:cs="Proxima Nova"/>
-          <w:sz w:val="24"/>
-          <w:szCs w:val="24"/>
-        </w:rPr>
-        <w:t>LangChain</w:t>
-      </w:r>
-      <w:proofErr w:type="spellEnd"/>
-      <w:r>
-        <w:rPr>
-          <w:rFonts w:ascii="Proxima Nova" w:eastAsia="Proxima Nova" w:hAnsi="Proxima Nova" w:cs="Proxima Nova"/>
-          <w:sz w:val="24"/>
-          <w:szCs w:val="24"/>
-        </w:rPr>
-        <w:t xml:space="preserve"> toolkit to connect with the DB</w:t>
-      </w:r>
-    </w:p>
-    <w:p>
-      <w:pPr>
-        <w:numPr>
-          <w:ilvl w:val="0"/>
-          <w:numId w:val="6"/>
-        </w:numPr>
-        <w:rPr>
-          <w:rFonts w:ascii="Proxima Nova" w:eastAsia="Proxima Nova" w:hAnsi="Proxima Nova" w:cs="Proxima Nova"/>
-          <w:sz w:val="24"/>
-          <w:szCs w:val="24"/>
-        </w:rPr>
-      </w:pPr>
-      <w:r>
-        <w:rPr>
-          <w:rFonts w:ascii="Proxima Nova" w:eastAsia="Proxima Nova" w:hAnsi="Proxima Nova" w:cs="Proxima Nova"/>
-          <w:sz w:val="24"/>
-          <w:szCs w:val="24"/>
-        </w:rPr>
-        <w:t xml:space="preserve">Develop a </w:t>
-      </w:r>
-      <w:proofErr w:type="gramStart"/>
-      <w:r>
-        <w:rPr>
-          <w:rFonts w:ascii="Proxima Nova" w:eastAsia="Proxima Nova" w:hAnsi="Proxima Nova" w:cs="Proxima Nova"/>
-          <w:sz w:val="24"/>
-          <w:szCs w:val="24"/>
-        </w:rPr>
-        <w:t>chat based</w:t>
-      </w:r>
-      <w:proofErr w:type="gramEnd"/>
-      <w:r>
-        <w:rPr>
-          <w:rFonts w:ascii="Proxima Nova" w:eastAsia="Proxima Nova" w:hAnsi="Proxima Nova" w:cs="Proxima Nova"/>
-          <w:sz w:val="24"/>
-          <w:szCs w:val="24"/>
-        </w:rPr>
-        <w:t xml:space="preserve"> application that has an ability to converse with the user and generate insights on the go using frameworks such as </w:t>
-      </w:r>
-      <w:proofErr w:type="spellStart"/>
-      <w:r>
-        <w:rPr>
-          <w:rFonts w:ascii="Proxima Nova" w:eastAsia="Proxima Nova" w:hAnsi="Proxima Nova" w:cs="Proxima Nova"/>
-          <w:sz w:val="24"/>
-          <w:szCs w:val="24"/>
-        </w:rPr>
-        <w:t>LangChain</w:t>
-      </w:r>
-      <w:proofErr w:type="spellEnd"/>
-      <w:r>
-        <w:rPr>
-          <w:rFonts w:ascii="Proxima Nova" w:eastAsia="Proxima Nova" w:hAnsi="Proxima Nova" w:cs="Proxima Nova"/>
-          <w:sz w:val="24"/>
-          <w:szCs w:val="24"/>
-        </w:rPr>
-        <w:t xml:space="preserve">, </w:t>
-      </w:r>
-      <w:proofErr w:type="spellStart"/>
-      <w:r>
-        <w:rPr>
-          <w:rFonts w:ascii="Proxima Nova" w:eastAsia="Proxima Nova" w:hAnsi="Proxima Nova" w:cs="Proxima Nova"/>
-          <w:sz w:val="24"/>
-          <w:szCs w:val="24"/>
-        </w:rPr>
-        <w:t>streamlit</w:t>
-      </w:r>
-      <w:proofErr w:type="spellEnd"/>
-    </w:p>
-    <w:p>
-      <w:pPr>
-        <w:jc w:val="center"/>
-        <w:rPr>
-          <w:rFonts w:ascii="Proxima Nova" w:eastAsia="Proxima Nova" w:hAnsi="Proxima Nova" w:cs="Proxima Nova"/>
-          <w:sz w:val="26"/>
-          <w:szCs w:val="26"/>
-        </w:rPr>
-      </w:pPr>
-      <w:r>
-        <w:rPr>
-          <w:rFonts w:ascii="Proxima Nova" w:eastAsia="Proxima Nova" w:hAnsi="Proxima Nova" w:cs="Proxima Nova"/>
-          <w:noProof/>
-          <w:sz w:val="26"/>
-          <w:szCs w:val="26"/>
-        </w:rPr>
-        <w:drawing>
-          <wp:inline distT="114300" distB="114300" distL="114300" distR="114300" wp14:anchorId="60EC530B" wp14:editId="60EC530C">
-            <wp:extent cx="2995613" cy="2368793"/>
-            <wp:effectExtent l="0" t="0" r="0" b="0"/>
-            <wp:docPr id="7" name="image3.png"/>
-            <wp:cNvGraphicFramePr/>
-            <a:graphic xmlns:a="http://schemas.openxmlformats.org/drawingml/2006/main">
-              <a:graphicData uri="http://schemas.openxmlformats.org/drawingml/2006/picture">
-                <pic:pic xmlns:pic="http://schemas.openxmlformats.org/drawingml/2006/picture">
-                  <pic:nvPicPr>
-                    <pic:cNvPr id="0" name="image3.png"/>
-                    <pic:cNvPicPr preferRelativeResize="0"/>
-                  </pic:nvPicPr>
-                  <pic:blipFill>
-                    <a:blip r:embed="rId8"/>
-                    <a:srcRect l="4152" t="17137" r="9800"/>
-                    <a:stretch>
-                      <a:fillRect/>
-                    </a:stretch>
-                  </pic:blipFill>
-                  <pic:spPr>
-                    <a:xfrm>
-                      <a:off x="0" y="0"/>
-                      <a:ext cx="2995613" cy="2368793"/>
-                    </a:xfrm>
-                    <a:prstGeom prst="rect">
-                      <a:avLst/>
-                    </a:prstGeom>
-                    <a:ln/>
-                  </pic:spPr>
-                </pic:pic>
-              </a:graphicData>
-            </a:graphic>
-          </wp:inline>
-        </w:drawing>
-      </w:r>
-    </w:p>
     <w:p>
       <w:pPr>
         <w:pStyle w:val="Heading1"/>
@@ -320,230 +21,97 @@
           <w:bCs/>
         </w:rPr>
       </w:pPr>
-      <w:bookmarkStart w:id="4" w:name="_heading=h.wx759lpipvro" w:colFirst="0" w:colLast="0"/>
-      <w:bookmarkEnd w:id="4"/>
-      <w:r>
-        <w:rPr>
-          <w:rFonts w:ascii="Proxima Nova" w:eastAsia="Proxima Nova" w:hAnsi="Proxima Nova" w:cs="Proxima Nova"/>
-          <w:b/>
-          <w:bCs/>
-        </w:rPr>
-        <w:t>How is Today’s Content Relevant to my Role?</w:t>
-      </w:r>
-    </w:p>
-    <w:p>
-      <w:pPr>
-        <w:numPr>
-          <w:ilvl w:val="0"/>
-          <w:numId w:val="4"/>
-        </w:numPr>
-        <w:pBdr>
-          <w:top w:val="none" w:sz="0" w:space="0" w:color="D9D9E3"/>
-          <w:left w:val="none" w:sz="0" w:space="0" w:color="D9D9E3"/>
-          <w:bottom w:val="none" w:sz="0" w:space="0" w:color="D9D9E3"/>
-          <w:right w:val="none" w:sz="0" w:space="0" w:color="D9D9E3"/>
-          <w:between w:val="none" w:sz="0" w:space="0" w:color="D9D9E3"/>
-        </w:pBdr>
-        <w:spacing w:before="240" w:line="360" w:lineRule="auto"/>
-        <w:rPr>
-          <w:rFonts w:ascii="Nunito" w:eastAsia="Nunito" w:hAnsi="Nunito" w:cs="Nunito"/>
-          <w:sz w:val="24"/>
-          <w:szCs w:val="24"/>
-        </w:rPr>
-      </w:pPr>
-      <w:r>
-        <w:rPr>
-          <w:rFonts w:ascii="Proxima Nova" w:eastAsia="Proxima Nova" w:hAnsi="Proxima Nova" w:cs="Proxima Nova"/>
-          <w:b/>
-          <w:bCs/>
-          <w:sz w:val="24"/>
-          <w:szCs w:val="24"/>
-        </w:rPr>
-        <w:lastRenderedPageBreak/>
-        <w:t>PMs</w:t>
-      </w:r>
-      <w:r>
-        <w:rPr>
-          <w:rFonts w:ascii="Proxima Nova" w:eastAsia="Proxima Nova" w:hAnsi="Proxima Nova" w:cs="Proxima Nova"/>
-          <w:sz w:val="24"/>
-          <w:szCs w:val="24"/>
-        </w:rPr>
-        <w:t>: Gain quick, data-driven insights to inform strategic decisions and enhance product development without writing any queries and code.</w:t>
-      </w:r>
-    </w:p>
-    <w:p>
-      <w:pPr>
-        <w:numPr>
-          <w:ilvl w:val="0"/>
-          <w:numId w:val="4"/>
-        </w:numPr>
-        <w:pBdr>
-          <w:top w:val="none" w:sz="0" w:space="0" w:color="D9D9E3"/>
-          <w:left w:val="none" w:sz="0" w:space="0" w:color="D9D9E3"/>
-          <w:bottom w:val="none" w:sz="0" w:space="0" w:color="D9D9E3"/>
-          <w:right w:val="none" w:sz="0" w:space="0" w:color="D9D9E3"/>
-          <w:between w:val="none" w:sz="0" w:space="0" w:color="D9D9E3"/>
-        </w:pBdr>
-        <w:spacing w:line="360" w:lineRule="auto"/>
-        <w:rPr>
-          <w:rFonts w:ascii="Nunito" w:eastAsia="Nunito" w:hAnsi="Nunito" w:cs="Nunito"/>
-          <w:sz w:val="24"/>
-          <w:szCs w:val="24"/>
-        </w:rPr>
-      </w:pPr>
-      <w:r>
-        <w:rPr>
-          <w:rFonts w:ascii="Proxima Nova" w:eastAsia="Proxima Nova" w:hAnsi="Proxima Nova" w:cs="Proxima Nova"/>
-          <w:b/>
-          <w:bCs/>
-          <w:sz w:val="24"/>
-          <w:szCs w:val="24"/>
-        </w:rPr>
-        <w:t>TPMs</w:t>
-      </w:r>
-      <w:r>
-        <w:rPr>
-          <w:rFonts w:ascii="Proxima Nova" w:eastAsia="Proxima Nova" w:hAnsi="Proxima Nova" w:cs="Proxima Nova"/>
-          <w:sz w:val="24"/>
-          <w:szCs w:val="24"/>
-        </w:rPr>
-        <w:t>: Facilitate efficient project management by identifying potential bottlenecks in GenAI projects and optimizing workflows.</w:t>
-      </w:r>
-    </w:p>
-    <w:p>
-      <w:pPr>
-        <w:numPr>
-          <w:ilvl w:val="0"/>
-          <w:numId w:val="4"/>
-        </w:numPr>
-        <w:pBdr>
-          <w:top w:val="none" w:sz="0" w:space="0" w:color="D9D9E3"/>
-          <w:left w:val="none" w:sz="0" w:space="0" w:color="D9D9E3"/>
-          <w:bottom w:val="none" w:sz="0" w:space="0" w:color="D9D9E3"/>
-          <w:right w:val="none" w:sz="0" w:space="0" w:color="D9D9E3"/>
-          <w:between w:val="none" w:sz="0" w:space="0" w:color="D9D9E3"/>
-        </w:pBdr>
-        <w:spacing w:line="360" w:lineRule="auto"/>
-        <w:rPr>
-          <w:rFonts w:ascii="Nunito" w:eastAsia="Nunito" w:hAnsi="Nunito" w:cs="Nunito"/>
-          <w:sz w:val="24"/>
-          <w:szCs w:val="24"/>
-        </w:rPr>
-      </w:pPr>
-      <w:r>
-        <w:rPr>
-          <w:rFonts w:ascii="Proxima Nova" w:eastAsia="Proxima Nova" w:hAnsi="Proxima Nova" w:cs="Proxima Nova"/>
-          <w:b/>
-          <w:bCs/>
-          <w:sz w:val="24"/>
-          <w:szCs w:val="24"/>
-        </w:rPr>
-        <w:t>SDEs</w:t>
-      </w:r>
-      <w:r>
-        <w:rPr>
-          <w:rFonts w:ascii="Proxima Nova" w:eastAsia="Proxima Nova" w:hAnsi="Proxima Nova" w:cs="Proxima Nova"/>
-          <w:sz w:val="24"/>
-          <w:szCs w:val="24"/>
-        </w:rPr>
-        <w:t>: Develop and integrate LLM-based components for natural language input processing and insights generation.</w:t>
-      </w:r>
-    </w:p>
-    <w:p>
-      <w:pPr>
-        <w:numPr>
-          <w:ilvl w:val="0"/>
-          <w:numId w:val="4"/>
-        </w:numPr>
-        <w:pBdr>
-          <w:top w:val="none" w:sz="0" w:space="0" w:color="D9D9E3"/>
-          <w:left w:val="none" w:sz="0" w:space="0" w:color="D9D9E3"/>
-          <w:bottom w:val="none" w:sz="0" w:space="0" w:color="D9D9E3"/>
-          <w:right w:val="none" w:sz="0" w:space="0" w:color="D9D9E3"/>
-          <w:between w:val="none" w:sz="0" w:space="0" w:color="D9D9E3"/>
-        </w:pBdr>
-        <w:spacing w:line="360" w:lineRule="auto"/>
-        <w:rPr>
-          <w:rFonts w:ascii="Nunito" w:eastAsia="Nunito" w:hAnsi="Nunito" w:cs="Nunito"/>
-          <w:sz w:val="24"/>
-          <w:szCs w:val="24"/>
-        </w:rPr>
-      </w:pPr>
-      <w:r>
-        <w:rPr>
-          <w:rFonts w:ascii="Proxima Nova" w:eastAsia="Proxima Nova" w:hAnsi="Proxima Nova" w:cs="Proxima Nova"/>
-          <w:b/>
-          <w:bCs/>
-          <w:sz w:val="24"/>
-          <w:szCs w:val="24"/>
-        </w:rPr>
-        <w:t>Engineering Managers</w:t>
-      </w:r>
-      <w:r>
-        <w:rPr>
-          <w:rFonts w:ascii="Proxima Nova" w:eastAsia="Proxima Nova" w:hAnsi="Proxima Nova" w:cs="Proxima Nova"/>
-          <w:sz w:val="24"/>
-          <w:szCs w:val="24"/>
-        </w:rPr>
-        <w:t>: Enhance team performance and GenAI project outcomes to guide new age engineering practices and resource allocation.</w:t>
-      </w:r>
-    </w:p>
-    <w:p>
-      <w:pPr>
-        <w:numPr>
-          <w:ilvl w:val="0"/>
-          <w:numId w:val="4"/>
-        </w:numPr>
-        <w:pBdr>
-          <w:top w:val="none" w:sz="0" w:space="0" w:color="D9D9E3"/>
-          <w:left w:val="none" w:sz="0" w:space="0" w:color="D9D9E3"/>
-          <w:bottom w:val="none" w:sz="0" w:space="0" w:color="D9D9E3"/>
-          <w:right w:val="none" w:sz="0" w:space="0" w:color="D9D9E3"/>
-          <w:between w:val="none" w:sz="0" w:space="0" w:color="D9D9E3"/>
-        </w:pBdr>
-        <w:spacing w:after="40" w:line="360" w:lineRule="auto"/>
-        <w:rPr>
-          <w:rFonts w:ascii="Nunito" w:eastAsia="Nunito" w:hAnsi="Nunito" w:cs="Nunito"/>
-          <w:sz w:val="24"/>
-          <w:szCs w:val="24"/>
-        </w:rPr>
-      </w:pPr>
-      <w:r>
-        <w:rPr>
-          <w:rFonts w:ascii="Proxima Nova" w:eastAsia="Proxima Nova" w:hAnsi="Proxima Nova" w:cs="Proxima Nova"/>
-          <w:b/>
-          <w:bCs/>
-          <w:sz w:val="24"/>
-          <w:szCs w:val="24"/>
-        </w:rPr>
-        <w:t>DevOps Engineers</w:t>
-      </w:r>
-      <w:r>
-        <w:rPr>
-          <w:rFonts w:ascii="Proxima Nova" w:eastAsia="Proxima Nova" w:hAnsi="Proxima Nova" w:cs="Proxima Nova"/>
-          <w:sz w:val="24"/>
-          <w:szCs w:val="24"/>
-        </w:rPr>
-        <w:t>: Build and maintain the infrastructure for scalable, reliable deployment and continuous integration of the LLM system.</w:t>
-      </w:r>
-    </w:p>
-    <w:p>
-      <w:pPr>
-        <w:pStyle w:val="Heading2"/>
-        <w:keepNext w:val="0"/>
-        <w:keepLines w:val="0"/>
-        <w:pBdr>
-          <w:top w:val="none" w:sz="0" w:space="0" w:color="D9D9E3"/>
-          <w:left w:val="none" w:sz="0" w:space="0" w:color="D9D9E3"/>
-          <w:bottom w:val="none" w:sz="0" w:space="0" w:color="D9D9E3"/>
-          <w:right w:val="none" w:sz="0" w:space="0" w:color="D9D9E3"/>
-          <w:between w:val="none" w:sz="0" w:space="0" w:color="D9D9E3"/>
-        </w:pBdr>
-        <w:spacing w:before="240" w:after="40" w:line="360" w:lineRule="auto"/>
-        <w:rPr>
-          <w:rFonts w:ascii="Proxima Nova" w:eastAsia="Proxima Nova" w:hAnsi="Proxima Nova" w:cs="Proxima Nova"/>
-        </w:rPr>
-      </w:pPr>
+      <w:bookmarkStart w:id="0" w:name="_heading=h.z3ulxa4r7vry" w:colFirst="0" w:colLast="0"/>
+      <w:bookmarkEnd w:id="0"/>
+      <w:r>
+        <w:rPr>
+          <w:rFonts w:ascii="Proxima Nova" w:eastAsia="Proxima Nova" w:hAnsi="Proxima Nova" w:cs="Proxima Nova"/>
+          <w:b/>
+          <w:bCs/>
+        </w:rPr>
+        <w:t>Dataset</w:t>
+      </w:r>
+    </w:p>
+    <w:p>
+      <w:pPr>
+        <w:rPr>
+          <w:rFonts w:ascii="Proxima Nova" w:eastAsia="Proxima Nova" w:hAnsi="Proxima Nova" w:cs="Proxima Nova"/>
+          <w:sz w:val="24"/>
+          <w:szCs w:val="24"/>
+        </w:rPr>
+      </w:pPr>
+      <w:r>
+        <w:rPr>
+          <w:rFonts w:ascii="Proxima Nova" w:eastAsia="Proxima Nova" w:hAnsi="Proxima Nova" w:cs="Proxima Nova"/>
+          <w:sz w:val="24"/>
+          <w:szCs w:val="24"/>
+        </w:rPr>
+        <w:t xml:space="preserve">We will be using the following e-commerce dataset: </w:t>
+      </w:r>
+      <w:hyperlink r:id="rId8">
+        <w:r>
+          <w:rPr>
+            <w:rFonts w:ascii="Proxima Nova" w:eastAsia="Proxima Nova" w:hAnsi="Proxima Nova" w:cs="Proxima Nova"/>
+            <w:color w:val="1155CC"/>
+            <w:sz w:val="24"/>
+            <w:szCs w:val="24"/>
+            <w:u w:val="single"/>
+          </w:rPr>
+          <w:t>https://drive.google.com/drive/folders/1FYM_baitHLWu6LZ6MNExqxqBm5OXM6l8</w:t>
+        </w:r>
+      </w:hyperlink>
+      <w:r>
+        <w:rPr>
+          <w:rFonts w:ascii="Proxima Nova" w:eastAsia="Proxima Nova" w:hAnsi="Proxima Nova" w:cs="Proxima Nova"/>
+          <w:sz w:val="24"/>
+          <w:szCs w:val="24"/>
+        </w:rPr>
+        <w:t xml:space="preserve"> </w:t>
+      </w:r>
+    </w:p>
+    <w:p>
+      <w:pPr>
+        <w:rPr>
+          <w:rFonts w:ascii="Proxima Nova" w:eastAsia="Proxima Nova" w:hAnsi="Proxima Nova" w:cs="Proxima Nova"/>
+          <w:sz w:val="24"/>
+          <w:szCs w:val="24"/>
+        </w:rPr>
+      </w:pPr>
+      <w:r>
+        <w:rPr>
+          <w:rFonts w:ascii="Proxima Nova" w:eastAsia="Proxima Nova" w:hAnsi="Proxima Nova" w:cs="Proxima Nova"/>
+          <w:sz w:val="24"/>
+          <w:szCs w:val="24"/>
+        </w:rPr>
+        <w:t>Though you can use any other openly available datasets as well.</w:t>
+      </w:r>
+    </w:p>
+    <w:p>
+      <w:pPr>
+        <w:rPr>
+          <w:rFonts w:ascii="Proxima Nova" w:eastAsia="Proxima Nova" w:hAnsi="Proxima Nova" w:cs="Proxima Nova"/>
+          <w:sz w:val="24"/>
+          <w:szCs w:val="24"/>
+        </w:rPr>
+      </w:pPr>
+    </w:p>
+    <w:p>
+      <w:pPr>
+        <w:rPr>
+          <w:rFonts w:ascii="Proxima Nova" w:eastAsia="Proxima Nova" w:hAnsi="Proxima Nova" w:cs="Proxima Nova"/>
+          <w:sz w:val="18"/>
+          <w:szCs w:val="18"/>
+        </w:rPr>
+      </w:pPr>
+    </w:p>
+    <w:p>
+      <w:pPr>
+        <w:rPr>
+          <w:rFonts w:ascii="Proxima Nova" w:eastAsia="Proxima Nova" w:hAnsi="Proxima Nova" w:cs="Proxima Nova"/>
+        </w:rPr>
+      </w:pPr>
+      <w:bookmarkStart w:id="1" w:name="_heading=h.l58rs5soq6z9" w:colFirst="0" w:colLast="0"/>
+      <w:bookmarkEnd w:id="1"/>
     </w:p>
     <w:p>
       <w:pPr>
@@ -564,329 +132,10 @@
           <w:bCs/>
         </w:rPr>
       </w:pPr>
-      <w:bookmarkStart w:id="5" w:name="_heading=h.z3ulxa4r7vry" w:colFirst="0" w:colLast="0"/>
-      <w:bookmarkEnd w:id="5"/>
-      <w:r>
-        <w:rPr>
-          <w:rFonts w:ascii="Proxima Nova" w:eastAsia="Proxima Nova" w:hAnsi="Proxima Nova" w:cs="Proxima Nova"/>
-          <w:b/>
-          <w:bCs/>
-        </w:rPr>
-        <w:t>Dataset</w:t>
-      </w:r>
-    </w:p>
-    <w:p>
-      <w:pPr>
-        <w:rPr>
-          <w:rFonts w:ascii="Proxima Nova" w:eastAsia="Proxima Nova" w:hAnsi="Proxima Nova" w:cs="Proxima Nova"/>
-          <w:sz w:val="24"/>
-          <w:szCs w:val="24"/>
-        </w:rPr>
-      </w:pPr>
-      <w:r>
-        <w:rPr>
-          <w:rFonts w:ascii="Proxima Nova" w:eastAsia="Proxima Nova" w:hAnsi="Proxima Nova" w:cs="Proxima Nova"/>
-          <w:sz w:val="24"/>
-          <w:szCs w:val="24"/>
-        </w:rPr>
-        <w:t xml:space="preserve">We will be using the following e-commerce dataset: </w:t>
-      </w:r>
-      <w:hyperlink r:id="rId9">
-        <w:r>
-          <w:rPr>
-            <w:rFonts w:ascii="Proxima Nova" w:eastAsia="Proxima Nova" w:hAnsi="Proxima Nova" w:cs="Proxima Nova"/>
-            <w:color w:val="1155CC"/>
-            <w:sz w:val="24"/>
-            <w:szCs w:val="24"/>
-            <w:u w:val="single"/>
-          </w:rPr>
-          <w:t>https://drive.google.com/drive/folders/1FYM_baitHLWu6LZ6MNExqxqBm5OXM6l8</w:t>
-        </w:r>
-      </w:hyperlink>
-      <w:r>
-        <w:rPr>
-          <w:rFonts w:ascii="Proxima Nova" w:eastAsia="Proxima Nova" w:hAnsi="Proxima Nova" w:cs="Proxima Nova"/>
-          <w:sz w:val="24"/>
-          <w:szCs w:val="24"/>
-        </w:rPr>
-        <w:t xml:space="preserve"> </w:t>
-      </w:r>
-    </w:p>
-    <w:p>
-      <w:pPr>
-        <w:rPr>
-          <w:rFonts w:ascii="Proxima Nova" w:eastAsia="Proxima Nova" w:hAnsi="Proxima Nova" w:cs="Proxima Nova"/>
-          <w:sz w:val="18"/>
-          <w:szCs w:val="18"/>
-        </w:rPr>
-      </w:pPr>
-      <w:r>
-        <w:rPr>
-          <w:rFonts w:ascii="Proxima Nova" w:eastAsia="Proxima Nova" w:hAnsi="Proxima Nova" w:cs="Proxima Nova"/>
-          <w:sz w:val="24"/>
-          <w:szCs w:val="24"/>
-        </w:rPr>
-        <w:t>Though you can use any other openly available datasets as well.</w:t>
-      </w:r>
-    </w:p>
-    <w:p>
-      <w:pPr>
-        <w:pStyle w:val="Heading1"/>
-        <w:keepNext w:val="0"/>
-        <w:keepLines w:val="0"/>
-        <w:pBdr>
-          <w:top w:val="none" w:sz="0" w:space="0" w:color="D9D9E3"/>
-          <w:left w:val="none" w:sz="0" w:space="0" w:color="D9D9E3"/>
-          <w:bottom w:val="none" w:sz="0" w:space="0" w:color="D9D9E3"/>
-          <w:right w:val="none" w:sz="0" w:space="0" w:color="D9D9E3"/>
-          <w:between w:val="none" w:sz="0" w:space="0" w:color="D9D9E3"/>
-        </w:pBdr>
-        <w:spacing w:before="240" w:after="40" w:line="360" w:lineRule="auto"/>
-        <w:rPr>
-          <w:rFonts w:ascii="Proxima Nova" w:eastAsia="Proxima Nova" w:hAnsi="Proxima Nova" w:cs="Proxima Nova"/>
-          <w:b/>
-          <w:bCs/>
-          <w:sz w:val="36"/>
-          <w:szCs w:val="36"/>
-        </w:rPr>
-      </w:pPr>
-      <w:bookmarkStart w:id="6" w:name="_heading=h.l58rs5soq6z9" w:colFirst="0" w:colLast="0"/>
-      <w:bookmarkEnd w:id="6"/>
-    </w:p>
-    <w:p>
-      <w:pPr>
-        <w:pStyle w:val="Heading1"/>
-        <w:keepNext w:val="0"/>
-        <w:keepLines w:val="0"/>
-        <w:pBdr>
-          <w:top w:val="none" w:sz="0" w:space="0" w:color="D9D9E3"/>
-          <w:left w:val="none" w:sz="0" w:space="0" w:color="D9D9E3"/>
-          <w:bottom w:val="none" w:sz="0" w:space="0" w:color="D9D9E3"/>
-          <w:right w:val="none" w:sz="0" w:space="0" w:color="D9D9E3"/>
-          <w:between w:val="none" w:sz="0" w:space="0" w:color="D9D9E3"/>
-        </w:pBdr>
-        <w:spacing w:before="240" w:after="40" w:line="360" w:lineRule="auto"/>
-        <w:rPr>
-          <w:rFonts w:ascii="Proxima Nova" w:eastAsia="Proxima Nova" w:hAnsi="Proxima Nova" w:cs="Proxima Nova"/>
-          <w:b/>
-          <w:bCs/>
-          <w:sz w:val="36"/>
-          <w:szCs w:val="36"/>
-        </w:rPr>
-      </w:pPr>
-      <w:bookmarkStart w:id="7" w:name="_heading=h.4dev9q5jrxtj" w:colFirst="0" w:colLast="0"/>
-      <w:bookmarkEnd w:id="7"/>
-    </w:p>
-    <w:p>
-      <w:pPr>
-        <w:pStyle w:val="Heading1"/>
-        <w:keepNext w:val="0"/>
-        <w:keepLines w:val="0"/>
-        <w:pBdr>
-          <w:top w:val="none" w:sz="0" w:space="0" w:color="D9D9E3"/>
-          <w:left w:val="none" w:sz="0" w:space="0" w:color="D9D9E3"/>
-          <w:bottom w:val="none" w:sz="0" w:space="0" w:color="D9D9E3"/>
-          <w:right w:val="none" w:sz="0" w:space="0" w:color="D9D9E3"/>
-          <w:between w:val="none" w:sz="0" w:space="0" w:color="D9D9E3"/>
-        </w:pBdr>
-        <w:spacing w:before="240" w:after="40" w:line="360" w:lineRule="auto"/>
-        <w:rPr>
-          <w:rFonts w:ascii="Proxima Nova" w:eastAsia="Proxima Nova" w:hAnsi="Proxima Nova" w:cs="Proxima Nova"/>
-          <w:b/>
-          <w:bCs/>
-          <w:sz w:val="36"/>
-          <w:szCs w:val="36"/>
-        </w:rPr>
-      </w:pPr>
-      <w:bookmarkStart w:id="8" w:name="_heading=h.d86kuuoiv1uc" w:colFirst="0" w:colLast="0"/>
-      <w:bookmarkEnd w:id="8"/>
-    </w:p>
-    <w:p/>
-    <w:p/>
-    <w:p/>
-    <w:p/>
-    <w:p/>
-    <w:p/>
-    <w:p/>
-    <w:p/>
-    <w:p/>
-    <w:p/>
-    <w:p/>
-    <w:p/>
-    <w:p>
-      <w:pPr>
-        <w:pStyle w:val="Heading1"/>
-        <w:keepNext w:val="0"/>
-        <w:keepLines w:val="0"/>
-        <w:pBdr>
-          <w:top w:val="none" w:sz="0" w:space="0" w:color="D9D9E3"/>
-          <w:left w:val="none" w:sz="0" w:space="0" w:color="D9D9E3"/>
-          <w:bottom w:val="none" w:sz="0" w:space="0" w:color="D9D9E3"/>
-          <w:right w:val="none" w:sz="0" w:space="0" w:color="D9D9E3"/>
-          <w:between w:val="none" w:sz="0" w:space="0" w:color="D9D9E3"/>
-        </w:pBdr>
-        <w:spacing w:before="240" w:after="40" w:line="360" w:lineRule="auto"/>
-        <w:rPr>
-          <w:rFonts w:ascii="Proxima Nova" w:eastAsia="Proxima Nova" w:hAnsi="Proxima Nova" w:cs="Proxima Nova"/>
-          <w:b/>
-          <w:bCs/>
-          <w:sz w:val="36"/>
-          <w:szCs w:val="36"/>
-        </w:rPr>
-      </w:pPr>
-      <w:bookmarkStart w:id="9" w:name="_heading=h.ruvr8pbeotkj" w:colFirst="0" w:colLast="0"/>
-      <w:bookmarkEnd w:id="9"/>
-      <w:r>
-        <w:rPr>
-          <w:rFonts w:ascii="Proxima Nova" w:eastAsia="Proxima Nova" w:hAnsi="Proxima Nova" w:cs="Proxima Nova"/>
-          <w:b/>
-          <w:bCs/>
-          <w:sz w:val="36"/>
-          <w:szCs w:val="36"/>
-        </w:rPr>
-        <w:lastRenderedPageBreak/>
-        <w:t>Example Output</w:t>
-      </w:r>
-    </w:p>
-    <w:p>
-      <w:pPr>
-        <w:rPr>
-          <w:rFonts w:ascii="Proxima Nova" w:eastAsia="Proxima Nova" w:hAnsi="Proxima Nova" w:cs="Proxima Nova"/>
-        </w:rPr>
-      </w:pPr>
-      <w:r>
-        <w:rPr>
-          <w:rFonts w:ascii="Proxima Nova" w:eastAsia="Proxima Nova" w:hAnsi="Proxima Nova" w:cs="Proxima Nova"/>
-          <w:noProof/>
-        </w:rPr>
-        <w:drawing>
-          <wp:inline distT="114300" distB="114300" distL="114300" distR="114300" wp14:anchorId="60EC530D" wp14:editId="60EC530E">
-            <wp:extent cx="5731200" cy="3048000"/>
-            <wp:effectExtent l="0" t="0" r="0" b="0"/>
-            <wp:docPr id="9" name="image4.png"/>
-            <wp:cNvGraphicFramePr/>
-            <a:graphic xmlns:a="http://schemas.openxmlformats.org/drawingml/2006/main">
-              <a:graphicData uri="http://schemas.openxmlformats.org/drawingml/2006/picture">
-                <pic:pic xmlns:pic="http://schemas.openxmlformats.org/drawingml/2006/picture">
-                  <pic:nvPicPr>
-                    <pic:cNvPr id="0" name="image4.png"/>
-                    <pic:cNvPicPr preferRelativeResize="0"/>
-                  </pic:nvPicPr>
-                  <pic:blipFill>
-                    <a:blip r:embed="rId10"/>
-                    <a:srcRect/>
-                    <a:stretch>
-                      <a:fillRect/>
-                    </a:stretch>
-                  </pic:blipFill>
-                  <pic:spPr>
-                    <a:xfrm>
-                      <a:off x="0" y="0"/>
-                      <a:ext cx="5731200" cy="3048000"/>
-                    </a:xfrm>
-                    <a:prstGeom prst="rect">
-                      <a:avLst/>
-                    </a:prstGeom>
-                    <a:ln/>
-                  </pic:spPr>
-                </pic:pic>
-              </a:graphicData>
-            </a:graphic>
-          </wp:inline>
-        </w:drawing>
-      </w:r>
-    </w:p>
-    <w:p>
-      <w:pPr>
-        <w:rPr>
-          <w:rFonts w:ascii="Proxima Nova" w:eastAsia="Proxima Nova" w:hAnsi="Proxima Nova" w:cs="Proxima Nova"/>
-        </w:rPr>
-      </w:pPr>
-      <w:r>
-        <w:rPr>
-          <w:rFonts w:ascii="Proxima Nova" w:eastAsia="Proxima Nova" w:hAnsi="Proxima Nova" w:cs="Proxima Nova"/>
-          <w:noProof/>
-        </w:rPr>
-        <w:drawing>
-          <wp:inline distT="114300" distB="114300" distL="114300" distR="114300" wp14:anchorId="60EC530F" wp14:editId="60EC5310">
-            <wp:extent cx="5731200" cy="3073400"/>
-            <wp:effectExtent l="0" t="0" r="0" b="0"/>
-            <wp:docPr id="8" name="image5.png"/>
-            <wp:cNvGraphicFramePr/>
-            <a:graphic xmlns:a="http://schemas.openxmlformats.org/drawingml/2006/main">
-              <a:graphicData uri="http://schemas.openxmlformats.org/drawingml/2006/picture">
-                <pic:pic xmlns:pic="http://schemas.openxmlformats.org/drawingml/2006/picture">
-                  <pic:nvPicPr>
-                    <pic:cNvPr id="0" name="image5.png"/>
-                    <pic:cNvPicPr preferRelativeResize="0"/>
-                  </pic:nvPicPr>
-                  <pic:blipFill>
-                    <a:blip r:embed="rId11"/>
-                    <a:srcRect/>
-                    <a:stretch>
-                      <a:fillRect/>
-                    </a:stretch>
-                  </pic:blipFill>
-                  <pic:spPr>
-                    <a:xfrm>
-                      <a:off x="0" y="0"/>
-                      <a:ext cx="5731200" cy="3073400"/>
-                    </a:xfrm>
-                    <a:prstGeom prst="rect">
-                      <a:avLst/>
-                    </a:prstGeom>
-                    <a:ln/>
-                  </pic:spPr>
-                </pic:pic>
-              </a:graphicData>
-            </a:graphic>
-          </wp:inline>
-        </w:drawing>
-      </w:r>
-    </w:p>
-    <w:p>
-      <w:pPr>
-        <w:pStyle w:val="Heading2"/>
-        <w:keepNext w:val="0"/>
-        <w:keepLines w:val="0"/>
-        <w:pBdr>
-          <w:top w:val="none" w:sz="0" w:space="0" w:color="D9D9E3"/>
-          <w:left w:val="none" w:sz="0" w:space="0" w:color="D9D9E3"/>
-          <w:bottom w:val="none" w:sz="0" w:space="0" w:color="D9D9E3"/>
-          <w:right w:val="none" w:sz="0" w:space="0" w:color="D9D9E3"/>
-          <w:between w:val="none" w:sz="0" w:space="0" w:color="D9D9E3"/>
-        </w:pBdr>
-        <w:spacing w:before="240" w:after="40" w:line="360" w:lineRule="auto"/>
-        <w:rPr>
-          <w:rFonts w:ascii="Proxima Nova" w:eastAsia="Proxima Nova" w:hAnsi="Proxima Nova" w:cs="Proxima Nova"/>
-          <w:sz w:val="28"/>
-          <w:szCs w:val="28"/>
-        </w:rPr>
-      </w:pPr>
-      <w:bookmarkStart w:id="10" w:name="_heading=h.ypoiapwmwoqo" w:colFirst="0" w:colLast="0"/>
-      <w:bookmarkEnd w:id="10"/>
-    </w:p>
-    <w:p>
-      <w:pPr>
-        <w:pStyle w:val="Heading1"/>
-        <w:keepNext w:val="0"/>
-        <w:keepLines w:val="0"/>
-        <w:pBdr>
-          <w:top w:val="none" w:sz="0" w:space="0" w:color="D9D9E3"/>
-          <w:left w:val="none" w:sz="0" w:space="0" w:color="D9D9E3"/>
-          <w:bottom w:val="none" w:sz="0" w:space="0" w:color="D9D9E3"/>
-          <w:right w:val="none" w:sz="0" w:space="0" w:color="D9D9E3"/>
-          <w:between w:val="none" w:sz="0" w:space="0" w:color="D9D9E3"/>
-        </w:pBdr>
-        <w:spacing w:before="240" w:after="40" w:line="360" w:lineRule="auto"/>
-        <w:rPr>
-          <w:rFonts w:ascii="Proxima Nova" w:eastAsia="Proxima Nova" w:hAnsi="Proxima Nova" w:cs="Proxima Nova"/>
-          <w:b/>
-          <w:bCs/>
-        </w:rPr>
-      </w:pPr>
-      <w:bookmarkStart w:id="11" w:name="_heading=h.tajqfhq2tnok" w:colFirst="0" w:colLast="0"/>
-      <w:bookmarkEnd w:id="11"/>
+      <w:bookmarkStart w:id="2" w:name="_heading=h.ypoiapwmwoqo" w:colFirst="0" w:colLast="0"/>
+      <w:bookmarkStart w:id="3" w:name="_heading=h.tajqfhq2tnok" w:colFirst="0" w:colLast="0"/>
+      <w:bookmarkEnd w:id="2"/>
+      <w:bookmarkEnd w:id="3"/>
       <w:r>
         <w:rPr>
           <w:rFonts w:ascii="Proxima Nova" w:eastAsia="Proxima Nova" w:hAnsi="Proxima Nova" w:cs="Proxima Nova"/>
@@ -923,7 +172,7 @@
         </w:rPr>
         <w:t xml:space="preserve">SQL - </w:t>
       </w:r>
-      <w:hyperlink r:id="rId12">
+      <w:hyperlink r:id="rId9">
         <w:r>
           <w:rPr>
             <w:rFonts w:ascii="Proxima Nova" w:eastAsia="Proxima Nova" w:hAnsi="Proxima Nova" w:cs="Proxima Nova"/>
@@ -984,7 +233,7 @@
         </w:rPr>
         <w:t xml:space="preserve">Python - </w:t>
       </w:r>
-      <w:hyperlink r:id="rId13">
+      <w:hyperlink r:id="rId10">
         <w:r>
           <w:rPr>
             <w:rFonts w:ascii="Proxima Nova" w:eastAsia="Proxima Nova" w:hAnsi="Proxima Nova" w:cs="Proxima Nova"/>
@@ -1037,7 +286,6 @@
           <w:sz w:val="24"/>
           <w:szCs w:val="24"/>
         </w:rPr>
-        <w:lastRenderedPageBreak/>
         <w:t>Langchain</w:t>
       </w:r>
       <w:proofErr w:type="spellEnd"/>
@@ -1049,7 +297,7 @@
         </w:rPr>
         <w:t xml:space="preserve"> - </w:t>
       </w:r>
-      <w:hyperlink r:id="rId14">
+      <w:hyperlink r:id="rId11">
         <w:r>
           <w:rPr>
             <w:rFonts w:ascii="Proxima Nova" w:eastAsia="Proxima Nova" w:hAnsi="Proxima Nova" w:cs="Proxima Nova"/>
@@ -1120,7 +368,7 @@
         </w:rPr>
         <w:t xml:space="preserve"> - </w:t>
       </w:r>
-      <w:hyperlink r:id="rId15">
+      <w:hyperlink r:id="rId12">
         <w:r>
           <w:rPr>
             <w:rFonts w:ascii="Proxima Nova" w:eastAsia="Proxima Nova" w:hAnsi="Proxima Nova" w:cs="Proxima Nova"/>
@@ -1203,8 +451,8 @@
           <w:szCs w:val="48"/>
         </w:rPr>
       </w:pPr>
-      <w:bookmarkStart w:id="12" w:name="_heading=h.udzzj2vqu1ee" w:colFirst="0" w:colLast="0"/>
-      <w:bookmarkEnd w:id="12"/>
+      <w:bookmarkStart w:id="4" w:name="_heading=h.udzzj2vqu1ee" w:colFirst="0" w:colLast="0"/>
+      <w:bookmarkEnd w:id="4"/>
       <w:r>
         <w:rPr>
           <w:rFonts w:ascii="Proxima Nova" w:eastAsia="Proxima Nova" w:hAnsi="Proxima Nova" w:cs="Proxima Nova"/>
@@ -1238,1086 +486,6 @@
       <w:pPr>
         <w:rPr>
           <w:rFonts w:ascii="Proxima Nova" w:eastAsia="Proxima Nova" w:hAnsi="Proxima Nova" w:cs="Proxima Nova"/>
-        </w:rPr>
-      </w:pPr>
-    </w:p>
-    <w:p>
-      <w:pPr>
-        <w:numPr>
-          <w:ilvl w:val="0"/>
-          <w:numId w:val="2"/>
-        </w:numPr>
-        <w:rPr>
-          <w:rFonts w:ascii="Proxima Nova" w:eastAsia="Proxima Nova" w:hAnsi="Proxima Nova" w:cs="Proxima Nova"/>
-          <w:sz w:val="24"/>
-          <w:szCs w:val="24"/>
-        </w:rPr>
-      </w:pPr>
-      <w:r>
-        <w:rPr>
-          <w:rFonts w:ascii="Proxima Nova" w:eastAsia="Proxima Nova" w:hAnsi="Proxima Nova" w:cs="Proxima Nova"/>
-          <w:b/>
-          <w:bCs/>
-          <w:sz w:val="24"/>
-          <w:szCs w:val="24"/>
-        </w:rPr>
-        <w:t>Setting up MySQL DB (</w:t>
-      </w:r>
-      <w:hyperlink r:id="rId16">
-        <w:r>
-          <w:rPr>
-            <w:rFonts w:ascii="Proxima Nova" w:eastAsia="Proxima Nova" w:hAnsi="Proxima Nova" w:cs="Proxima Nova"/>
-            <w:b/>
-            <w:bCs/>
-            <w:color w:val="1155CC"/>
-            <w:sz w:val="24"/>
-            <w:szCs w:val="24"/>
-            <w:u w:val="single"/>
-          </w:rPr>
-          <w:t>MacOS</w:t>
-        </w:r>
-      </w:hyperlink>
-      <w:r>
-        <w:rPr>
-          <w:sz w:val="24"/>
-          <w:szCs w:val="24"/>
-        </w:rPr>
-        <w:t xml:space="preserve">, </w:t>
-      </w:r>
-      <w:hyperlink r:id="rId17">
-        <w:r>
-          <w:rPr>
-            <w:rFonts w:ascii="Proxima Nova" w:eastAsia="Proxima Nova" w:hAnsi="Proxima Nova" w:cs="Proxima Nova"/>
-            <w:b/>
-            <w:bCs/>
-            <w:color w:val="1155CC"/>
-            <w:sz w:val="24"/>
-            <w:szCs w:val="24"/>
-            <w:u w:val="single"/>
-          </w:rPr>
-          <w:t>Windows</w:t>
-        </w:r>
-      </w:hyperlink>
-      <w:r>
-        <w:rPr>
-          <w:rFonts w:ascii="Proxima Nova" w:eastAsia="Proxima Nova" w:hAnsi="Proxima Nova" w:cs="Proxima Nova"/>
-          <w:b/>
-          <w:bCs/>
-          <w:sz w:val="24"/>
-          <w:szCs w:val="24"/>
-        </w:rPr>
-        <w:t>)</w:t>
-      </w:r>
-    </w:p>
-    <w:p>
-      <w:pPr>
-        <w:numPr>
-          <w:ilvl w:val="1"/>
-          <w:numId w:val="2"/>
-        </w:numPr>
-        <w:rPr>
-          <w:sz w:val="26"/>
-          <w:szCs w:val="26"/>
-        </w:rPr>
-      </w:pPr>
-      <w:hyperlink r:id="rId18">
-        <w:r>
-          <w:rPr>
-            <w:rFonts w:ascii="Proxima Nova" w:eastAsia="Proxima Nova" w:hAnsi="Proxima Nova" w:cs="Proxima Nova"/>
-            <w:b/>
-            <w:bCs/>
-            <w:color w:val="1155CC"/>
-            <w:sz w:val="24"/>
-            <w:szCs w:val="24"/>
-            <w:u w:val="single"/>
-          </w:rPr>
-          <w:t>Step by Step Video 1 for Mac</w:t>
-        </w:r>
-      </w:hyperlink>
-      <w:r>
-        <w:rPr>
-          <w:rFonts w:ascii="Proxima Nova" w:eastAsia="Proxima Nova" w:hAnsi="Proxima Nova" w:cs="Proxima Nova"/>
-          <w:sz w:val="24"/>
-          <w:szCs w:val="24"/>
-        </w:rPr>
-        <w:t xml:space="preserve"> (feel free to post questions in the comments)</w:t>
-      </w:r>
-    </w:p>
-    <w:p>
-      <w:pPr>
-        <w:numPr>
-          <w:ilvl w:val="1"/>
-          <w:numId w:val="2"/>
-        </w:numPr>
-        <w:rPr>
-          <w:sz w:val="26"/>
-          <w:szCs w:val="26"/>
-        </w:rPr>
-      </w:pPr>
-      <w:hyperlink r:id="rId19">
-        <w:r>
-          <w:rPr>
-            <w:rFonts w:ascii="Proxima Nova" w:eastAsia="Proxima Nova" w:hAnsi="Proxima Nova" w:cs="Proxima Nova"/>
-            <w:b/>
-            <w:bCs/>
-            <w:color w:val="1155CC"/>
-            <w:sz w:val="24"/>
-            <w:szCs w:val="24"/>
-            <w:u w:val="single"/>
-          </w:rPr>
-          <w:t>Step by Step Video 2 for Mac</w:t>
-        </w:r>
-      </w:hyperlink>
-      <w:r>
-        <w:rPr>
-          <w:rFonts w:ascii="Proxima Nova" w:eastAsia="Proxima Nova" w:hAnsi="Proxima Nova" w:cs="Proxima Nova"/>
-          <w:sz w:val="24"/>
-          <w:szCs w:val="24"/>
-        </w:rPr>
-        <w:t xml:space="preserve"> (feel free to post questions in the comments)</w:t>
-      </w:r>
-    </w:p>
-    <w:p>
-      <w:pPr>
-        <w:numPr>
-          <w:ilvl w:val="1"/>
-          <w:numId w:val="2"/>
-        </w:numPr>
-        <w:rPr>
-          <w:rFonts w:ascii="Proxima Nova" w:eastAsia="Proxima Nova" w:hAnsi="Proxima Nova" w:cs="Proxima Nova"/>
-          <w:sz w:val="24"/>
-          <w:szCs w:val="24"/>
-        </w:rPr>
-      </w:pPr>
-      <w:r>
-        <w:rPr>
-          <w:rFonts w:ascii="Proxima Nova" w:eastAsia="Proxima Nova" w:hAnsi="Proxima Nova" w:cs="Proxima Nova"/>
-          <w:sz w:val="24"/>
-          <w:szCs w:val="24"/>
-        </w:rPr>
-        <w:t xml:space="preserve">For Windows: Please make sure MySQL is installed. Run: </w:t>
-      </w:r>
-      <w:proofErr w:type="spellStart"/>
-      <w:r>
-        <w:rPr>
-          <w:rFonts w:ascii="Consolas" w:eastAsia="Consolas" w:hAnsi="Consolas" w:cs="Consolas"/>
-          <w:color w:val="FFFFFF"/>
-          <w:sz w:val="24"/>
-          <w:szCs w:val="24"/>
-          <w:shd w:val="clear" w:color="auto" w:fill="333333"/>
-        </w:rPr>
-        <w:t>mysqld</w:t>
-      </w:r>
-      <w:proofErr w:type="spellEnd"/>
-      <w:r>
-        <w:rPr>
-          <w:rFonts w:ascii="Consolas" w:eastAsia="Consolas" w:hAnsi="Consolas" w:cs="Consolas"/>
-          <w:color w:val="FFFFFF"/>
-          <w:sz w:val="24"/>
-          <w:szCs w:val="24"/>
-          <w:shd w:val="clear" w:color="auto" w:fill="333333"/>
-        </w:rPr>
-        <w:t xml:space="preserve"> </w:t>
-      </w:r>
-      <w:r>
-        <w:rPr>
-          <w:rFonts w:ascii="Consolas" w:eastAsia="Consolas" w:hAnsi="Consolas" w:cs="Consolas"/>
-          <w:color w:val="888888"/>
-          <w:sz w:val="24"/>
-          <w:szCs w:val="24"/>
-          <w:shd w:val="clear" w:color="auto" w:fill="333333"/>
-        </w:rPr>
-        <w:t>--version</w:t>
-      </w:r>
-      <w:r>
-        <w:rPr>
-          <w:rFonts w:ascii="Proxima Nova" w:eastAsia="Proxima Nova" w:hAnsi="Proxima Nova" w:cs="Proxima Nova"/>
-          <w:sz w:val="24"/>
-          <w:szCs w:val="24"/>
-        </w:rPr>
-        <w:t xml:space="preserve"> to check. If the command isn’t recognized please go to  </w:t>
-      </w:r>
-      <w:hyperlink r:id="rId20">
-        <w:r>
-          <w:rPr>
-            <w:rFonts w:ascii="Proxima Nova" w:eastAsia="Proxima Nova" w:hAnsi="Proxima Nova" w:cs="Proxima Nova"/>
-            <w:b/>
-            <w:bCs/>
-            <w:color w:val="0000EE"/>
-            <w:sz w:val="24"/>
-            <w:szCs w:val="24"/>
-            <w:u w:val="single"/>
-          </w:rPr>
-          <w:t>PROJECT SOLUTION STEP BY STEP</w:t>
-        </w:r>
-      </w:hyperlink>
-      <w:r>
-        <w:rPr>
-          <w:rFonts w:ascii="Proxima Nova" w:eastAsia="Proxima Nova" w:hAnsi="Proxima Nova" w:cs="Proxima Nova"/>
-          <w:sz w:val="24"/>
-          <w:szCs w:val="24"/>
-        </w:rPr>
-        <w:t xml:space="preserve"> and look at the MySQL section to troubleshoot.</w:t>
-      </w:r>
-    </w:p>
-    <w:p>
-      <w:pPr>
-        <w:ind w:left="1440"/>
-        <w:rPr>
-          <w:rFonts w:ascii="Proxima Nova" w:eastAsia="Proxima Nova" w:hAnsi="Proxima Nova" w:cs="Proxima Nova"/>
-          <w:sz w:val="24"/>
-          <w:szCs w:val="24"/>
-        </w:rPr>
-      </w:pPr>
-    </w:p>
-    <w:p>
-      <w:pPr>
-        <w:numPr>
-          <w:ilvl w:val="0"/>
-          <w:numId w:val="2"/>
-        </w:numPr>
-        <w:rPr>
-          <w:rFonts w:ascii="Proxima Nova" w:eastAsia="Proxima Nova" w:hAnsi="Proxima Nova" w:cs="Proxima Nova"/>
-          <w:b/>
-          <w:bCs/>
-          <w:sz w:val="24"/>
-          <w:szCs w:val="24"/>
-        </w:rPr>
-      </w:pPr>
-      <w:r>
-        <w:rPr>
-          <w:rFonts w:ascii="Proxima Nova" w:eastAsia="Proxima Nova" w:hAnsi="Proxima Nova" w:cs="Proxima Nova"/>
-          <w:b/>
-          <w:bCs/>
-          <w:sz w:val="24"/>
-          <w:szCs w:val="24"/>
-        </w:rPr>
-        <w:t xml:space="preserve">Setting up MySQL Workbench </w:t>
-      </w:r>
-      <w:r>
-        <w:rPr>
-          <w:rFonts w:ascii="Proxima Nova" w:eastAsia="Proxima Nova" w:hAnsi="Proxima Nova" w:cs="Proxima Nova"/>
-          <w:sz w:val="24"/>
-          <w:szCs w:val="24"/>
-        </w:rPr>
-        <w:t>(</w:t>
-      </w:r>
-      <w:hyperlink r:id="rId21">
-        <w:r>
-          <w:rPr>
-            <w:rFonts w:ascii="Proxima Nova" w:eastAsia="Proxima Nova" w:hAnsi="Proxima Nova" w:cs="Proxima Nova"/>
-            <w:b/>
-            <w:bCs/>
-            <w:color w:val="1155CC"/>
-            <w:sz w:val="24"/>
-            <w:szCs w:val="24"/>
-            <w:u w:val="single"/>
-          </w:rPr>
-          <w:t>MacOS</w:t>
-        </w:r>
-      </w:hyperlink>
-      <w:r>
-        <w:rPr>
-          <w:rFonts w:ascii="Proxima Nova" w:eastAsia="Proxima Nova" w:hAnsi="Proxima Nova" w:cs="Proxima Nova"/>
-          <w:sz w:val="24"/>
-          <w:szCs w:val="24"/>
-        </w:rPr>
-        <w:t xml:space="preserve">, </w:t>
-      </w:r>
-      <w:hyperlink r:id="rId22">
-        <w:r>
-          <w:rPr>
-            <w:rFonts w:ascii="Proxima Nova" w:eastAsia="Proxima Nova" w:hAnsi="Proxima Nova" w:cs="Proxima Nova"/>
-            <w:b/>
-            <w:bCs/>
-            <w:color w:val="1155CC"/>
-            <w:sz w:val="24"/>
-            <w:szCs w:val="24"/>
-            <w:u w:val="single"/>
-          </w:rPr>
-          <w:t>Windows</w:t>
-        </w:r>
-      </w:hyperlink>
-      <w:r>
-        <w:rPr>
-          <w:rFonts w:ascii="Proxima Nova" w:eastAsia="Proxima Nova" w:hAnsi="Proxima Nova" w:cs="Proxima Nova"/>
-          <w:sz w:val="24"/>
-          <w:szCs w:val="24"/>
-        </w:rPr>
-        <w:t xml:space="preserve">) </w:t>
-      </w:r>
-      <w:r>
-        <w:rPr>
-          <w:rFonts w:ascii="Proxima Nova" w:eastAsia="Proxima Nova" w:hAnsi="Proxima Nova" w:cs="Proxima Nova"/>
-          <w:b/>
-          <w:bCs/>
-          <w:color w:val="FF0000"/>
-          <w:sz w:val="24"/>
-          <w:szCs w:val="24"/>
-        </w:rPr>
-        <w:t>[WORKBENCH IS OPTIONAL]</w:t>
-      </w:r>
-    </w:p>
-    <w:p>
-      <w:pPr>
-        <w:numPr>
-          <w:ilvl w:val="1"/>
-          <w:numId w:val="2"/>
-        </w:numPr>
-        <w:rPr>
-          <w:sz w:val="26"/>
-          <w:szCs w:val="26"/>
-        </w:rPr>
-      </w:pPr>
-      <w:hyperlink r:id="rId23">
-        <w:r>
-          <w:rPr>
-            <w:rFonts w:ascii="Proxima Nova" w:eastAsia="Proxima Nova" w:hAnsi="Proxima Nova" w:cs="Proxima Nova"/>
-            <w:b/>
-            <w:bCs/>
-            <w:color w:val="1155CC"/>
-            <w:sz w:val="24"/>
-            <w:szCs w:val="24"/>
-            <w:u w:val="single"/>
-          </w:rPr>
-          <w:t>Step by Step Video 3</w:t>
-        </w:r>
-      </w:hyperlink>
-      <w:r>
-        <w:rPr>
-          <w:rFonts w:ascii="Proxima Nova" w:eastAsia="Proxima Nova" w:hAnsi="Proxima Nova" w:cs="Proxima Nova"/>
-          <w:sz w:val="24"/>
-          <w:szCs w:val="24"/>
-        </w:rPr>
-        <w:t xml:space="preserve"> (feel free to post questions in the comments)</w:t>
-      </w:r>
-    </w:p>
-    <w:p>
-      <w:pPr>
-        <w:numPr>
-          <w:ilvl w:val="1"/>
-          <w:numId w:val="2"/>
-        </w:numPr>
-        <w:rPr>
-          <w:sz w:val="26"/>
-          <w:szCs w:val="26"/>
-        </w:rPr>
-      </w:pPr>
-      <w:hyperlink r:id="rId24">
-        <w:r>
-          <w:rPr>
-            <w:rFonts w:ascii="Proxima Nova" w:eastAsia="Proxima Nova" w:hAnsi="Proxima Nova" w:cs="Proxima Nova"/>
-            <w:b/>
-            <w:bCs/>
-            <w:color w:val="1155CC"/>
-            <w:sz w:val="24"/>
-            <w:szCs w:val="24"/>
-            <w:u w:val="single"/>
-          </w:rPr>
-          <w:t>Step by Step Video 4</w:t>
-        </w:r>
-      </w:hyperlink>
-      <w:r>
-        <w:rPr>
-          <w:rFonts w:ascii="Proxima Nova" w:eastAsia="Proxima Nova" w:hAnsi="Proxima Nova" w:cs="Proxima Nova"/>
-          <w:sz w:val="24"/>
-          <w:szCs w:val="24"/>
-        </w:rPr>
-        <w:t xml:space="preserve"> (feel free to post questions in the comments). Make sure to create a localhost connection with user=</w:t>
-      </w:r>
-      <w:r>
-        <w:rPr>
-          <w:rFonts w:ascii="Proxima Nova" w:eastAsia="Proxima Nova" w:hAnsi="Proxima Nova" w:cs="Proxima Nova"/>
-          <w:b/>
-          <w:bCs/>
-          <w:sz w:val="24"/>
-          <w:szCs w:val="24"/>
-        </w:rPr>
-        <w:t>root</w:t>
-      </w:r>
-      <w:r>
-        <w:rPr>
-          <w:rFonts w:ascii="Proxima Nova" w:eastAsia="Proxima Nova" w:hAnsi="Proxima Nova" w:cs="Proxima Nova"/>
-          <w:sz w:val="24"/>
-          <w:szCs w:val="24"/>
-        </w:rPr>
-        <w:t xml:space="preserve"> and port=</w:t>
-      </w:r>
-      <w:r>
-        <w:rPr>
-          <w:rFonts w:ascii="Proxima Nova" w:eastAsia="Proxima Nova" w:hAnsi="Proxima Nova" w:cs="Proxima Nova"/>
-          <w:b/>
-          <w:bCs/>
-          <w:sz w:val="24"/>
-          <w:szCs w:val="24"/>
-        </w:rPr>
-        <w:t>3306.</w:t>
-      </w:r>
-    </w:p>
-    <w:p>
-      <w:pPr>
-        <w:ind w:left="1440"/>
-        <w:rPr>
-          <w:rFonts w:ascii="Proxima Nova" w:eastAsia="Proxima Nova" w:hAnsi="Proxima Nova" w:cs="Proxima Nova"/>
-          <w:sz w:val="24"/>
-          <w:szCs w:val="24"/>
-        </w:rPr>
-      </w:pPr>
-      <w:r>
-        <w:rPr>
-          <w:noProof/>
-        </w:rPr>
-        <w:drawing>
-          <wp:anchor distT="0" distB="0" distL="0" distR="0" simplePos="0" relativeHeight="251658240" behindDoc="1" locked="0" layoutInCell="1" hidden="0" allowOverlap="1" wp14:anchorId="60EC5311" wp14:editId="60EC5312">
-            <wp:simplePos x="0" y="0"/>
-            <wp:positionH relativeFrom="column">
-              <wp:posOffset>752475</wp:posOffset>
-            </wp:positionH>
-            <wp:positionV relativeFrom="paragraph">
-              <wp:posOffset>213467</wp:posOffset>
-            </wp:positionV>
-            <wp:extent cx="4628331" cy="3035280"/>
-            <wp:effectExtent l="0" t="0" r="0" b="0"/>
-            <wp:wrapNone/>
-            <wp:docPr id="6" name="image1.png"/>
-            <wp:cNvGraphicFramePr/>
-            <a:graphic xmlns:a="http://schemas.openxmlformats.org/drawingml/2006/main">
-              <a:graphicData uri="http://schemas.openxmlformats.org/drawingml/2006/picture">
-                <pic:pic xmlns:pic="http://schemas.openxmlformats.org/drawingml/2006/picture">
-                  <pic:nvPicPr>
-                    <pic:cNvPr id="0" name="image1.png"/>
-                    <pic:cNvPicPr preferRelativeResize="0"/>
-                  </pic:nvPicPr>
-                  <pic:blipFill>
-                    <a:blip r:embed="rId25"/>
-                    <a:srcRect/>
-                    <a:stretch>
-                      <a:fillRect/>
-                    </a:stretch>
-                  </pic:blipFill>
-                  <pic:spPr>
-                    <a:xfrm>
-                      <a:off x="0" y="0"/>
-                      <a:ext cx="4628331" cy="3035280"/>
-                    </a:xfrm>
-                    <a:prstGeom prst="rect">
-                      <a:avLst/>
-                    </a:prstGeom>
-                    <a:ln/>
-                  </pic:spPr>
-                </pic:pic>
-              </a:graphicData>
-            </a:graphic>
-          </wp:anchor>
-        </w:drawing>
-      </w:r>
-    </w:p>
-    <w:p>
-      <w:pPr>
-        <w:ind w:left="720"/>
-        <w:rPr>
-          <w:rFonts w:ascii="Proxima Nova" w:eastAsia="Proxima Nova" w:hAnsi="Proxima Nova" w:cs="Proxima Nova"/>
-          <w:sz w:val="28"/>
-          <w:szCs w:val="28"/>
-        </w:rPr>
-      </w:pPr>
-    </w:p>
-    <w:p>
-      <w:pPr>
-        <w:ind w:left="720"/>
-        <w:rPr>
-          <w:rFonts w:ascii="Proxima Nova" w:eastAsia="Proxima Nova" w:hAnsi="Proxima Nova" w:cs="Proxima Nova"/>
-          <w:sz w:val="28"/>
-          <w:szCs w:val="28"/>
-        </w:rPr>
-      </w:pPr>
-    </w:p>
-    <w:p>
-      <w:pPr>
-        <w:ind w:left="1440"/>
-        <w:rPr>
-          <w:rFonts w:ascii="Proxima Nova" w:eastAsia="Proxima Nova" w:hAnsi="Proxima Nova" w:cs="Proxima Nova"/>
-          <w:sz w:val="26"/>
-          <w:szCs w:val="26"/>
-        </w:rPr>
-      </w:pPr>
-    </w:p>
-    <w:p>
-      <w:pPr>
-        <w:ind w:left="1440"/>
-        <w:rPr>
-          <w:rFonts w:ascii="Proxima Nova" w:eastAsia="Proxima Nova" w:hAnsi="Proxima Nova" w:cs="Proxima Nova"/>
-          <w:sz w:val="26"/>
-          <w:szCs w:val="26"/>
-        </w:rPr>
-      </w:pPr>
-    </w:p>
-    <w:p>
-      <w:pPr>
-        <w:ind w:left="1440"/>
-        <w:rPr>
-          <w:rFonts w:ascii="Proxima Nova" w:eastAsia="Proxima Nova" w:hAnsi="Proxima Nova" w:cs="Proxima Nova"/>
-          <w:sz w:val="26"/>
-          <w:szCs w:val="26"/>
-        </w:rPr>
-      </w:pPr>
-    </w:p>
-    <w:p>
-      <w:pPr>
-        <w:ind w:left="1440"/>
-        <w:rPr>
-          <w:rFonts w:ascii="Proxima Nova" w:eastAsia="Proxima Nova" w:hAnsi="Proxima Nova" w:cs="Proxima Nova"/>
-          <w:sz w:val="26"/>
-          <w:szCs w:val="26"/>
-        </w:rPr>
-      </w:pPr>
-    </w:p>
-    <w:p>
-      <w:pPr>
-        <w:ind w:left="720"/>
-        <w:rPr>
-          <w:rFonts w:ascii="Proxima Nova" w:eastAsia="Proxima Nova" w:hAnsi="Proxima Nova" w:cs="Proxima Nova"/>
-          <w:sz w:val="26"/>
-          <w:szCs w:val="26"/>
-        </w:rPr>
-      </w:pPr>
-    </w:p>
-    <w:p>
-      <w:pPr>
-        <w:ind w:left="1440"/>
-        <w:rPr>
-          <w:rFonts w:ascii="Proxima Nova" w:eastAsia="Proxima Nova" w:hAnsi="Proxima Nova" w:cs="Proxima Nova"/>
-          <w:sz w:val="26"/>
-          <w:szCs w:val="26"/>
-        </w:rPr>
-      </w:pPr>
-    </w:p>
-    <w:p>
-      <w:pPr>
-        <w:ind w:left="1440"/>
-        <w:rPr>
-          <w:rFonts w:ascii="Proxima Nova" w:eastAsia="Proxima Nova" w:hAnsi="Proxima Nova" w:cs="Proxima Nova"/>
-          <w:sz w:val="26"/>
-          <w:szCs w:val="26"/>
-        </w:rPr>
-      </w:pPr>
-    </w:p>
-    <w:p>
-      <w:pPr>
-        <w:pStyle w:val="Heading1"/>
-        <w:keepNext w:val="0"/>
-        <w:keepLines w:val="0"/>
-        <w:pBdr>
-          <w:top w:val="none" w:sz="0" w:space="0" w:color="D9D9E3"/>
-          <w:left w:val="none" w:sz="0" w:space="0" w:color="D9D9E3"/>
-          <w:bottom w:val="none" w:sz="0" w:space="0" w:color="D9D9E3"/>
-          <w:right w:val="none" w:sz="0" w:space="0" w:color="D9D9E3"/>
-          <w:between w:val="none" w:sz="0" w:space="0" w:color="D9D9E3"/>
-        </w:pBdr>
-        <w:spacing w:before="240" w:after="40" w:line="360" w:lineRule="auto"/>
-        <w:rPr>
-          <w:rFonts w:ascii="Proxima Nova" w:eastAsia="Proxima Nova" w:hAnsi="Proxima Nova" w:cs="Proxima Nova"/>
-          <w:b/>
-          <w:bCs/>
-          <w:sz w:val="24"/>
-          <w:szCs w:val="24"/>
-        </w:rPr>
-      </w:pPr>
-      <w:bookmarkStart w:id="13" w:name="_heading=h.heju1088n9uv" w:colFirst="0" w:colLast="0"/>
-      <w:bookmarkEnd w:id="13"/>
-    </w:p>
-    <w:p/>
-    <w:p/>
-    <w:p>
-      <w:pPr>
-        <w:numPr>
-          <w:ilvl w:val="0"/>
-          <w:numId w:val="2"/>
-        </w:numPr>
-        <w:rPr>
-          <w:rFonts w:ascii="Proxima Nova" w:eastAsia="Proxima Nova" w:hAnsi="Proxima Nova" w:cs="Proxima Nova"/>
-          <w:sz w:val="24"/>
-          <w:szCs w:val="24"/>
-        </w:rPr>
-      </w:pPr>
-      <w:r>
-        <w:rPr>
-          <w:rFonts w:ascii="Proxima Nova" w:eastAsia="Proxima Nova" w:hAnsi="Proxima Nova" w:cs="Proxima Nova"/>
-          <w:b/>
-          <w:bCs/>
-          <w:sz w:val="24"/>
-          <w:szCs w:val="24"/>
-        </w:rPr>
-        <w:t>Installing Python (Windows PowerShell) - Recommended (Python 3.12.4)</w:t>
-      </w:r>
-    </w:p>
-    <w:p>
-      <w:pPr>
-        <w:numPr>
-          <w:ilvl w:val="1"/>
-          <w:numId w:val="2"/>
-        </w:numPr>
-        <w:rPr>
-          <w:sz w:val="28"/>
-          <w:szCs w:val="28"/>
-        </w:rPr>
-      </w:pPr>
-      <w:r>
-        <w:rPr>
-          <w:rFonts w:ascii="Proxima Nova" w:eastAsia="Proxima Nova" w:hAnsi="Proxima Nova" w:cs="Proxima Nova"/>
-          <w:sz w:val="28"/>
-          <w:szCs w:val="28"/>
-        </w:rPr>
-        <w:t xml:space="preserve">In Windows, open </w:t>
-      </w:r>
-      <w:proofErr w:type="spellStart"/>
-      <w:r>
-        <w:rPr>
-          <w:rFonts w:ascii="Proxima Nova" w:eastAsia="Proxima Nova" w:hAnsi="Proxima Nova" w:cs="Proxima Nova"/>
-          <w:sz w:val="28"/>
-          <w:szCs w:val="28"/>
-        </w:rPr>
-        <w:t>Powershell</w:t>
-      </w:r>
-      <w:proofErr w:type="spellEnd"/>
-      <w:r>
-        <w:rPr>
-          <w:rFonts w:ascii="Proxima Nova" w:eastAsia="Proxima Nova" w:hAnsi="Proxima Nova" w:cs="Proxima Nova"/>
-          <w:sz w:val="28"/>
-          <w:szCs w:val="28"/>
-        </w:rPr>
-        <w:t xml:space="preserve">. Press </w:t>
-      </w:r>
-      <w:r>
-        <w:rPr>
-          <w:rFonts w:ascii="Roboto Mono" w:eastAsia="Roboto Mono" w:hAnsi="Roboto Mono" w:cs="Roboto Mono"/>
-          <w:b/>
-          <w:bCs/>
-          <w:color w:val="188038"/>
-          <w:sz w:val="28"/>
-          <w:szCs w:val="28"/>
-        </w:rPr>
-        <w:t>Windows</w:t>
-      </w:r>
-      <w:r>
-        <w:rPr>
-          <w:rFonts w:ascii="Proxima Nova" w:eastAsia="Proxima Nova" w:hAnsi="Proxima Nova" w:cs="Proxima Nova"/>
-          <w:sz w:val="28"/>
-          <w:szCs w:val="28"/>
-        </w:rPr>
-        <w:t xml:space="preserve"> key or click on the </w:t>
-      </w:r>
-      <w:r>
-        <w:rPr>
-          <w:rFonts w:ascii="Roboto Mono" w:eastAsia="Roboto Mono" w:hAnsi="Roboto Mono" w:cs="Roboto Mono"/>
-          <w:b/>
-          <w:bCs/>
-          <w:color w:val="188038"/>
-          <w:sz w:val="28"/>
-          <w:szCs w:val="28"/>
-        </w:rPr>
-        <w:t>Start</w:t>
-      </w:r>
-      <w:r>
-        <w:rPr>
-          <w:rFonts w:ascii="Nova Mono" w:eastAsia="Nova Mono" w:hAnsi="Nova Mono" w:cs="Nova Mono"/>
-          <w:sz w:val="28"/>
-          <w:szCs w:val="28"/>
-        </w:rPr>
-        <w:t xml:space="preserve"> menu icon → Type </w:t>
-      </w:r>
-      <w:proofErr w:type="spellStart"/>
-      <w:r>
-        <w:rPr>
-          <w:rFonts w:ascii="Roboto Mono" w:eastAsia="Roboto Mono" w:hAnsi="Roboto Mono" w:cs="Roboto Mono"/>
-          <w:b/>
-          <w:bCs/>
-          <w:color w:val="188038"/>
-          <w:sz w:val="28"/>
-          <w:szCs w:val="28"/>
-        </w:rPr>
-        <w:t>PoweShell</w:t>
-      </w:r>
-      <w:proofErr w:type="spellEnd"/>
-      <w:r>
-        <w:rPr>
-          <w:rFonts w:ascii="Proxima Nova" w:eastAsia="Proxima Nova" w:hAnsi="Proxima Nova" w:cs="Proxima Nova"/>
-          <w:sz w:val="28"/>
-          <w:szCs w:val="28"/>
-        </w:rPr>
-        <w:t xml:space="preserve"> and press </w:t>
-      </w:r>
-      <w:r>
-        <w:rPr>
-          <w:rFonts w:ascii="Roboto Mono" w:eastAsia="Roboto Mono" w:hAnsi="Roboto Mono" w:cs="Roboto Mono"/>
-          <w:b/>
-          <w:bCs/>
-          <w:color w:val="188038"/>
-          <w:sz w:val="28"/>
-          <w:szCs w:val="28"/>
-        </w:rPr>
-        <w:t>Enter</w:t>
-      </w:r>
-      <w:r>
-        <w:rPr>
-          <w:rFonts w:ascii="Proxima Nova" w:eastAsia="Proxima Nova" w:hAnsi="Proxima Nova" w:cs="Proxima Nova"/>
-          <w:sz w:val="28"/>
-          <w:szCs w:val="28"/>
-        </w:rPr>
-        <w:t>.</w:t>
-      </w:r>
-    </w:p>
-    <w:p>
-      <w:pPr>
-        <w:numPr>
-          <w:ilvl w:val="1"/>
-          <w:numId w:val="2"/>
-        </w:numPr>
-      </w:pPr>
-      <w:r>
-        <w:rPr>
-          <w:sz w:val="26"/>
-          <w:szCs w:val="26"/>
-        </w:rPr>
-        <w:t xml:space="preserve"> </w:t>
-      </w:r>
-      <w:r>
-        <w:rPr>
-          <w:rFonts w:ascii="Proxima Nova" w:eastAsia="Proxima Nova" w:hAnsi="Proxima Nova" w:cs="Proxima Nova"/>
-          <w:sz w:val="28"/>
-          <w:szCs w:val="28"/>
-        </w:rPr>
-        <w:t>Run</w:t>
-      </w:r>
-      <w:r>
-        <w:rPr>
-          <w:sz w:val="26"/>
-          <w:szCs w:val="26"/>
-        </w:rPr>
-        <w:t xml:space="preserve"> </w:t>
-      </w:r>
-      <w:r>
-        <w:rPr>
-          <w:rFonts w:ascii="Consolas" w:eastAsia="Consolas" w:hAnsi="Consolas" w:cs="Consolas"/>
-          <w:color w:val="B392F0"/>
-          <w:sz w:val="28"/>
-          <w:szCs w:val="28"/>
-          <w:shd w:val="clear" w:color="auto" w:fill="24292E"/>
-        </w:rPr>
-        <w:t>python --version</w:t>
-      </w:r>
-      <w:r>
-        <w:rPr>
-          <w:sz w:val="26"/>
-          <w:szCs w:val="26"/>
-        </w:rPr>
-        <w:t xml:space="preserve"> </w:t>
-      </w:r>
-      <w:r>
-        <w:rPr>
-          <w:rFonts w:ascii="Proxima Nova" w:eastAsia="Proxima Nova" w:hAnsi="Proxima Nova" w:cs="Proxima Nova"/>
-          <w:sz w:val="28"/>
-          <w:szCs w:val="28"/>
-        </w:rPr>
-        <w:t>to see if you already have python installed</w:t>
-      </w:r>
-    </w:p>
-    <w:p>
-      <w:pPr>
-        <w:numPr>
-          <w:ilvl w:val="1"/>
-          <w:numId w:val="2"/>
-        </w:numPr>
-        <w:rPr>
-          <w:sz w:val="30"/>
-          <w:szCs w:val="30"/>
-        </w:rPr>
-      </w:pPr>
-      <w:r>
-        <w:rPr>
-          <w:rFonts w:ascii="Proxima Nova" w:eastAsia="Proxima Nova" w:hAnsi="Proxima Nova" w:cs="Proxima Nova"/>
-          <w:b/>
-          <w:bCs/>
-          <w:sz w:val="28"/>
-          <w:szCs w:val="28"/>
-        </w:rPr>
-        <w:t>Download</w:t>
-      </w:r>
-      <w:r>
-        <w:rPr>
-          <w:rFonts w:ascii="Proxima Nova" w:eastAsia="Proxima Nova" w:hAnsi="Proxima Nova" w:cs="Proxima Nova"/>
-          <w:sz w:val="28"/>
-          <w:szCs w:val="28"/>
-        </w:rPr>
-        <w:t xml:space="preserve"> the </w:t>
-      </w:r>
-      <w:hyperlink r:id="rId26">
-        <w:r>
-          <w:rPr>
-            <w:rFonts w:ascii="Proxima Nova" w:eastAsia="Proxima Nova" w:hAnsi="Proxima Nova" w:cs="Proxima Nova"/>
-            <w:color w:val="1155CC"/>
-            <w:sz w:val="28"/>
-            <w:szCs w:val="28"/>
-            <w:u w:val="single"/>
-          </w:rPr>
-          <w:t>Python Installer</w:t>
-        </w:r>
-      </w:hyperlink>
-      <w:r>
-        <w:rPr>
-          <w:rFonts w:ascii="Proxima Nova" w:eastAsia="Proxima Nova" w:hAnsi="Proxima Nova" w:cs="Proxima Nova"/>
-          <w:sz w:val="28"/>
-          <w:szCs w:val="28"/>
-        </w:rPr>
-        <w:t xml:space="preserve">. To do that, pick your machine architecture (64-bit, ARM64, 32-bit) etc and then run the following </w:t>
-      </w:r>
-      <w:proofErr w:type="spellStart"/>
-      <w:r>
-        <w:rPr>
-          <w:rFonts w:ascii="Proxima Nova" w:eastAsia="Proxima Nova" w:hAnsi="Proxima Nova" w:cs="Proxima Nova"/>
-          <w:sz w:val="28"/>
-          <w:szCs w:val="28"/>
-        </w:rPr>
-        <w:t>powershell</w:t>
-      </w:r>
-      <w:proofErr w:type="spellEnd"/>
-      <w:r>
-        <w:rPr>
-          <w:rFonts w:ascii="Proxima Nova" w:eastAsia="Proxima Nova" w:hAnsi="Proxima Nova" w:cs="Proxima Nova"/>
-          <w:sz w:val="28"/>
-          <w:szCs w:val="28"/>
-        </w:rPr>
-        <w:t xml:space="preserve"> command: </w:t>
-      </w:r>
-      <w:r>
-        <w:rPr>
-          <w:rFonts w:ascii="Consolas" w:eastAsia="Consolas" w:hAnsi="Consolas" w:cs="Consolas"/>
-          <w:color w:val="B392F0"/>
-          <w:sz w:val="28"/>
-          <w:szCs w:val="28"/>
-          <w:shd w:val="clear" w:color="auto" w:fill="24292E"/>
-        </w:rPr>
-        <w:t xml:space="preserve">curl -o python-3.12.4-amd64.exe </w:t>
-      </w:r>
-      <w:hyperlink r:id="rId27">
-        <w:r>
-          <w:rPr>
-            <w:rFonts w:ascii="Consolas" w:eastAsia="Consolas" w:hAnsi="Consolas" w:cs="Consolas"/>
-            <w:color w:val="1155CC"/>
-            <w:sz w:val="28"/>
-            <w:szCs w:val="28"/>
-            <w:u w:val="single"/>
-            <w:shd w:val="clear" w:color="auto" w:fill="24292E"/>
-          </w:rPr>
-          <w:t>https://www.python.org/ftp/python/3.12.4/python-3.12.4-amd64.exe</w:t>
-        </w:r>
-      </w:hyperlink>
-    </w:p>
-    <w:p>
-      <w:pPr>
-        <w:numPr>
-          <w:ilvl w:val="1"/>
-          <w:numId w:val="2"/>
-        </w:numPr>
-        <w:rPr>
-          <w:sz w:val="28"/>
-          <w:szCs w:val="28"/>
-        </w:rPr>
-      </w:pPr>
-      <w:r>
-        <w:rPr>
-          <w:rFonts w:ascii="Proxima Nova" w:eastAsia="Proxima Nova" w:hAnsi="Proxima Nova" w:cs="Proxima Nova"/>
-          <w:b/>
-          <w:bCs/>
-          <w:sz w:val="28"/>
-          <w:szCs w:val="28"/>
-        </w:rPr>
-        <w:t>Run the Downloaded Installer:</w:t>
-      </w:r>
-      <w:r>
-        <w:rPr>
-          <w:rFonts w:ascii="Proxima Nova" w:eastAsia="Proxima Nova" w:hAnsi="Proxima Nova" w:cs="Proxima Nova"/>
-          <w:sz w:val="28"/>
-          <w:szCs w:val="28"/>
-        </w:rPr>
-        <w:t xml:space="preserve"> </w:t>
-      </w:r>
-      <w:r>
-        <w:rPr>
-          <w:rFonts w:ascii="Consolas" w:eastAsia="Consolas" w:hAnsi="Consolas" w:cs="Consolas"/>
-          <w:color w:val="B392F0"/>
-          <w:sz w:val="28"/>
-          <w:szCs w:val="28"/>
-          <w:shd w:val="clear" w:color="auto" w:fill="24292E"/>
-        </w:rPr>
-        <w:t xml:space="preserve">.\python-3.12.4-amd64.exe /quiet </w:t>
-      </w:r>
-      <w:proofErr w:type="spellStart"/>
-      <w:r>
-        <w:rPr>
-          <w:rFonts w:ascii="Consolas" w:eastAsia="Consolas" w:hAnsi="Consolas" w:cs="Consolas"/>
-          <w:color w:val="B392F0"/>
-          <w:sz w:val="28"/>
-          <w:szCs w:val="28"/>
-          <w:shd w:val="clear" w:color="auto" w:fill="24292E"/>
-        </w:rPr>
-        <w:t>InstallAllUsers</w:t>
-      </w:r>
-      <w:proofErr w:type="spellEnd"/>
-      <w:r>
-        <w:rPr>
-          <w:rFonts w:ascii="Consolas" w:eastAsia="Consolas" w:hAnsi="Consolas" w:cs="Consolas"/>
-          <w:color w:val="B392F0"/>
-          <w:sz w:val="28"/>
-          <w:szCs w:val="28"/>
-          <w:shd w:val="clear" w:color="auto" w:fill="24292E"/>
-        </w:rPr>
-        <w:t xml:space="preserve">=1 </w:t>
-      </w:r>
-      <w:proofErr w:type="spellStart"/>
-      <w:r>
-        <w:rPr>
-          <w:rFonts w:ascii="Consolas" w:eastAsia="Consolas" w:hAnsi="Consolas" w:cs="Consolas"/>
-          <w:color w:val="B392F0"/>
-          <w:sz w:val="28"/>
-          <w:szCs w:val="28"/>
-          <w:shd w:val="clear" w:color="auto" w:fill="24292E"/>
-        </w:rPr>
-        <w:t>PrependPath</w:t>
-      </w:r>
-      <w:proofErr w:type="spellEnd"/>
-      <w:r>
-        <w:rPr>
-          <w:rFonts w:ascii="Consolas" w:eastAsia="Consolas" w:hAnsi="Consolas" w:cs="Consolas"/>
-          <w:color w:val="B392F0"/>
-          <w:sz w:val="28"/>
-          <w:szCs w:val="28"/>
-          <w:shd w:val="clear" w:color="auto" w:fill="24292E"/>
-        </w:rPr>
-        <w:t>=1</w:t>
-      </w:r>
-    </w:p>
-    <w:p>
-      <w:pPr>
-        <w:numPr>
-          <w:ilvl w:val="1"/>
-          <w:numId w:val="2"/>
-        </w:numPr>
-        <w:rPr>
-          <w:sz w:val="28"/>
-          <w:szCs w:val="28"/>
-        </w:rPr>
-      </w:pPr>
-      <w:r>
-        <w:rPr>
-          <w:rFonts w:ascii="Proxima Nova" w:eastAsia="Proxima Nova" w:hAnsi="Proxima Nova" w:cs="Proxima Nova"/>
-          <w:b/>
-          <w:bCs/>
-          <w:sz w:val="28"/>
-          <w:szCs w:val="28"/>
-        </w:rPr>
-        <w:t xml:space="preserve">Verify </w:t>
-      </w:r>
-      <w:r>
-        <w:rPr>
-          <w:rFonts w:ascii="Proxima Nova" w:eastAsia="Proxima Nova" w:hAnsi="Proxima Nova" w:cs="Proxima Nova"/>
-          <w:sz w:val="28"/>
-          <w:szCs w:val="28"/>
-        </w:rPr>
-        <w:t xml:space="preserve">the installation with this </w:t>
-      </w:r>
-      <w:proofErr w:type="spellStart"/>
-      <w:r>
-        <w:rPr>
-          <w:rFonts w:ascii="Proxima Nova" w:eastAsia="Proxima Nova" w:hAnsi="Proxima Nova" w:cs="Proxima Nova"/>
-          <w:sz w:val="28"/>
-          <w:szCs w:val="28"/>
-        </w:rPr>
-        <w:t>powershell</w:t>
-      </w:r>
-      <w:proofErr w:type="spellEnd"/>
-      <w:r>
-        <w:rPr>
-          <w:rFonts w:ascii="Proxima Nova" w:eastAsia="Proxima Nova" w:hAnsi="Proxima Nova" w:cs="Proxima Nova"/>
-          <w:sz w:val="28"/>
-          <w:szCs w:val="28"/>
-        </w:rPr>
-        <w:t xml:space="preserve"> command: </w:t>
-      </w:r>
-      <w:r>
-        <w:rPr>
-          <w:rFonts w:ascii="Consolas" w:eastAsia="Consolas" w:hAnsi="Consolas" w:cs="Consolas"/>
-          <w:color w:val="B392F0"/>
-          <w:sz w:val="28"/>
-          <w:szCs w:val="28"/>
-          <w:shd w:val="clear" w:color="auto" w:fill="24292E"/>
-        </w:rPr>
-        <w:t>python --version</w:t>
-      </w:r>
-    </w:p>
-    <w:p>
-      <w:pPr>
-        <w:ind w:left="1440"/>
-        <w:rPr>
-          <w:rFonts w:ascii="Proxima Nova" w:eastAsia="Proxima Nova" w:hAnsi="Proxima Nova" w:cs="Proxima Nova"/>
-          <w:sz w:val="24"/>
-          <w:szCs w:val="24"/>
-        </w:rPr>
-      </w:pPr>
-    </w:p>
-    <w:p>
-      <w:pPr>
-        <w:rPr>
-          <w:rFonts w:ascii="Proxima Nova" w:eastAsia="Proxima Nova" w:hAnsi="Proxima Nova" w:cs="Proxima Nova"/>
-          <w:b/>
-          <w:bCs/>
-          <w:sz w:val="20"/>
-          <w:szCs w:val="20"/>
-        </w:rPr>
-      </w:pPr>
-      <w:r>
-        <w:rPr>
-          <w:rFonts w:ascii="Proxima Nova" w:eastAsia="Proxima Nova" w:hAnsi="Proxima Nova" w:cs="Proxima Nova"/>
-          <w:b/>
-          <w:bCs/>
-          <w:color w:val="FF0000"/>
-          <w:sz w:val="48"/>
-          <w:szCs w:val="48"/>
-        </w:rPr>
-        <w:t xml:space="preserve">PROCEED TO </w:t>
-      </w:r>
-      <w:hyperlink r:id="rId28">
-        <w:r>
-          <w:rPr>
-            <w:rFonts w:ascii="Proxima Nova" w:eastAsia="Proxima Nova" w:hAnsi="Proxima Nova" w:cs="Proxima Nova"/>
-            <w:b/>
-            <w:bCs/>
-            <w:color w:val="0000EE"/>
-            <w:sz w:val="48"/>
-            <w:szCs w:val="48"/>
-            <w:u w:val="single"/>
-          </w:rPr>
-          <w:t>Project Solution Step By Step</w:t>
-        </w:r>
-      </w:hyperlink>
-      <w:r>
-        <w:rPr>
-          <w:rFonts w:ascii="Proxima Nova" w:eastAsia="Proxima Nova" w:hAnsi="Proxima Nova" w:cs="Proxima Nova"/>
-          <w:b/>
-          <w:bCs/>
-          <w:color w:val="FF0000"/>
-          <w:sz w:val="48"/>
-          <w:szCs w:val="48"/>
-        </w:rPr>
-        <w:t xml:space="preserve"> TO RUN THE PROJECT AHEAD OF TIME</w:t>
-      </w:r>
-    </w:p>
-    <w:p>
-      <w:pPr>
-        <w:rPr>
-          <w:rFonts w:ascii="Proxima Nova" w:eastAsia="Proxima Nova" w:hAnsi="Proxima Nova" w:cs="Proxima Nova"/>
-          <w:sz w:val="28"/>
-          <w:szCs w:val="28"/>
         </w:rPr>
       </w:pPr>
     </w:p>
@@ -2528,6 +696,7 @@
           <w:sz w:val="24"/>
           <w:szCs w:val="24"/>
         </w:rPr>
+        <w:lastRenderedPageBreak/>
         <w:t>llm_agent.py</w:t>
       </w:r>
       <w:r>
@@ -2554,16 +723,7 @@
           <w:sz w:val="24"/>
           <w:szCs w:val="24"/>
         </w:rPr>
-        <w:t xml:space="preserve"> library for executing tasks related to data processing and </w:t>
-      </w:r>
-      <w:r>
-        <w:rPr>
-          <w:rFonts w:ascii="Proxima Nova" w:eastAsia="Proxima Nova" w:hAnsi="Proxima Nova" w:cs="Proxima Nova"/>
-          <w:sz w:val="24"/>
-          <w:szCs w:val="24"/>
-        </w:rPr>
-        <w:lastRenderedPageBreak/>
-        <w:t xml:space="preserve">querying. It sets up SQL database connections, defines custom instructions for handling queries, and provides functions to create language model agents tailored for specific tasks, such as </w:t>
+        <w:t xml:space="preserve"> library for executing tasks related to data processing and querying. It sets up SQL database connections, defines custom instructions for handling queries, and provides functions to create language model agents tailored for specific tasks, such as </w:t>
       </w:r>
       <w:r>
         <w:rPr>
@@ -2713,62 +873,6 @@
     </w:p>
     <w:p>
       <w:pPr>
-        <w:rPr>
-          <w:rFonts w:ascii="Proxima Nova" w:eastAsia="Proxima Nova" w:hAnsi="Proxima Nova" w:cs="Proxima Nova"/>
-          <w:b/>
-          <w:bCs/>
-          <w:sz w:val="28"/>
-          <w:szCs w:val="28"/>
-        </w:rPr>
-      </w:pPr>
-      <w:r>
-        <w:rPr>
-          <w:rFonts w:ascii="Proxima Nova" w:eastAsia="Proxima Nova" w:hAnsi="Proxima Nova" w:cs="Proxima Nova"/>
-          <w:b/>
-          <w:bCs/>
-          <w:noProof/>
-          <w:sz w:val="28"/>
-          <w:szCs w:val="28"/>
-        </w:rPr>
-        <w:drawing>
-          <wp:inline distT="114300" distB="114300" distL="114300" distR="114300" wp14:anchorId="60EC5313" wp14:editId="60EC5314">
-            <wp:extent cx="5731200" cy="3517900"/>
-            <wp:effectExtent l="0" t="0" r="0" b="0"/>
-            <wp:docPr id="10" name="image2.png"/>
-            <wp:cNvGraphicFramePr/>
-            <a:graphic xmlns:a="http://schemas.openxmlformats.org/drawingml/2006/main">
-              <a:graphicData uri="http://schemas.openxmlformats.org/drawingml/2006/picture">
-                <pic:pic xmlns:pic="http://schemas.openxmlformats.org/drawingml/2006/picture">
-                  <pic:nvPicPr>
-                    <pic:cNvPr id="0" name="image2.png"/>
-                    <pic:cNvPicPr preferRelativeResize="0"/>
-                  </pic:nvPicPr>
-                  <pic:blipFill>
-                    <a:blip r:embed="rId29"/>
-                    <a:srcRect/>
-                    <a:stretch>
-                      <a:fillRect/>
-                    </a:stretch>
-                  </pic:blipFill>
-                  <pic:spPr>
-                    <a:xfrm>
-                      <a:off x="0" y="0"/>
-                      <a:ext cx="5731200" cy="3517900"/>
-                    </a:xfrm>
-                    <a:prstGeom prst="rect">
-                      <a:avLst/>
-                    </a:prstGeom>
-                    <a:ln/>
-                  </pic:spPr>
-                </pic:pic>
-              </a:graphicData>
-            </a:graphic>
-          </wp:inline>
-        </w:drawing>
-      </w:r>
-    </w:p>
-    <w:p>
-      <w:pPr>
         <w:pStyle w:val="Heading1"/>
         <w:rPr>
           <w:rFonts w:ascii="Proxima Nova" w:eastAsia="Proxima Nova" w:hAnsi="Proxima Nova" w:cs="Proxima Nova"/>
@@ -2776,305 +880,8 @@
           <w:bCs/>
         </w:rPr>
       </w:pPr>
-      <w:bookmarkStart w:id="14" w:name="_heading=h.787bzmgldvpb" w:colFirst="0" w:colLast="0"/>
-      <w:bookmarkEnd w:id="14"/>
-      <w:r>
-        <w:rPr>
-          <w:rFonts w:ascii="Proxima Nova" w:eastAsia="Proxima Nova" w:hAnsi="Proxima Nova" w:cs="Proxima Nova"/>
-          <w:b/>
-          <w:bCs/>
-        </w:rPr>
-        <w:t>Milestones</w:t>
-      </w:r>
-    </w:p>
-    <w:p>
-      <w:pPr>
-        <w:rPr>
-          <w:rFonts w:ascii="Proxima Nova" w:eastAsia="Proxima Nova" w:hAnsi="Proxima Nova" w:cs="Proxima Nova"/>
-        </w:rPr>
-      </w:pPr>
-    </w:p>
-    <w:p>
-      <w:pPr>
-        <w:numPr>
-          <w:ilvl w:val="0"/>
-          <w:numId w:val="7"/>
-        </w:numPr>
-        <w:rPr>
-          <w:rFonts w:ascii="Nunito" w:eastAsia="Nunito" w:hAnsi="Nunito" w:cs="Nunito"/>
-          <w:sz w:val="24"/>
-          <w:szCs w:val="24"/>
-        </w:rPr>
-      </w:pPr>
-      <w:r>
-        <w:rPr>
-          <w:rFonts w:ascii="Proxima Nova" w:eastAsia="Proxima Nova" w:hAnsi="Proxima Nova" w:cs="Proxima Nova"/>
-          <w:b/>
-          <w:bCs/>
-          <w:sz w:val="24"/>
-          <w:szCs w:val="24"/>
-        </w:rPr>
-        <w:t>Data Pipeline and Integration</w:t>
-      </w:r>
-      <w:r>
-        <w:rPr>
-          <w:rFonts w:ascii="Proxima Nova" w:eastAsia="Proxima Nova" w:hAnsi="Proxima Nova" w:cs="Proxima Nova"/>
-          <w:sz w:val="24"/>
-          <w:szCs w:val="24"/>
-        </w:rPr>
-        <w:t xml:space="preserve"> - Build a robust data pipeline that automatically loads all CSV files into a SQL database. Create relevant databases and tables along with the right schema. </w:t>
-      </w:r>
-    </w:p>
-    <w:p>
-      <w:pPr>
-        <w:numPr>
-          <w:ilvl w:val="0"/>
-          <w:numId w:val="7"/>
-        </w:numPr>
-        <w:rPr>
-          <w:rFonts w:ascii="Nunito" w:eastAsia="Nunito" w:hAnsi="Nunito" w:cs="Nunito"/>
-          <w:sz w:val="24"/>
-          <w:szCs w:val="24"/>
-        </w:rPr>
-      </w:pPr>
-      <w:r>
-        <w:rPr>
-          <w:rFonts w:ascii="Proxima Nova" w:eastAsia="Proxima Nova" w:hAnsi="Proxima Nova" w:cs="Proxima Nova"/>
-          <w:b/>
-          <w:bCs/>
-          <w:sz w:val="24"/>
-          <w:szCs w:val="24"/>
-        </w:rPr>
-        <w:t xml:space="preserve">Explore </w:t>
-      </w:r>
-      <w:proofErr w:type="spellStart"/>
-      <w:r>
-        <w:rPr>
-          <w:rFonts w:ascii="Proxima Nova" w:eastAsia="Proxima Nova" w:hAnsi="Proxima Nova" w:cs="Proxima Nova"/>
-          <w:b/>
-          <w:bCs/>
-          <w:sz w:val="24"/>
-          <w:szCs w:val="24"/>
-        </w:rPr>
-        <w:t>LangChain</w:t>
-      </w:r>
-      <w:proofErr w:type="spellEnd"/>
-      <w:r>
-        <w:rPr>
-          <w:rFonts w:ascii="Proxima Nova" w:eastAsia="Proxima Nova" w:hAnsi="Proxima Nova" w:cs="Proxima Nova"/>
-          <w:sz w:val="24"/>
-          <w:szCs w:val="24"/>
-        </w:rPr>
-        <w:t xml:space="preserve"> - Utilise the </w:t>
-      </w:r>
-      <w:proofErr w:type="spellStart"/>
-      <w:r>
-        <w:rPr>
-          <w:rFonts w:ascii="Proxima Nova" w:eastAsia="Proxima Nova" w:hAnsi="Proxima Nova" w:cs="Proxima Nova"/>
-          <w:sz w:val="24"/>
-          <w:szCs w:val="24"/>
-        </w:rPr>
-        <w:t>LangChain</w:t>
-      </w:r>
-      <w:proofErr w:type="spellEnd"/>
-      <w:r>
-        <w:rPr>
-          <w:rFonts w:ascii="Proxima Nova" w:eastAsia="Proxima Nova" w:hAnsi="Proxima Nova" w:cs="Proxima Nova"/>
-          <w:sz w:val="24"/>
-          <w:szCs w:val="24"/>
-        </w:rPr>
-        <w:t xml:space="preserve"> toolkit to establish connections with the database for efficient data retrieval. Ensure proper handling of data ingestion, transformation, and storage to facilitate easy access for insights generation.</w:t>
-      </w:r>
-    </w:p>
-    <w:p>
-      <w:pPr>
-        <w:numPr>
-          <w:ilvl w:val="0"/>
-          <w:numId w:val="7"/>
-        </w:numPr>
-        <w:rPr>
-          <w:rFonts w:ascii="Nunito" w:eastAsia="Nunito" w:hAnsi="Nunito" w:cs="Nunito"/>
-          <w:sz w:val="24"/>
-          <w:szCs w:val="24"/>
-        </w:rPr>
-      </w:pPr>
-      <w:r>
-        <w:rPr>
-          <w:rFonts w:ascii="Proxima Nova" w:eastAsia="Proxima Nova" w:hAnsi="Proxima Nova" w:cs="Proxima Nova"/>
-          <w:b/>
-          <w:bCs/>
-          <w:sz w:val="24"/>
-          <w:szCs w:val="24"/>
-        </w:rPr>
-        <w:t>Prompt Engineering</w:t>
-      </w:r>
-      <w:r>
-        <w:rPr>
-          <w:rFonts w:ascii="Proxima Nova" w:eastAsia="Proxima Nova" w:hAnsi="Proxima Nova" w:cs="Proxima Nova"/>
-          <w:sz w:val="24"/>
-          <w:szCs w:val="24"/>
-        </w:rPr>
-        <w:t xml:space="preserve"> - Explore </w:t>
-      </w:r>
-      <w:proofErr w:type="spellStart"/>
-      <w:r>
-        <w:rPr>
-          <w:rFonts w:ascii="Proxima Nova" w:eastAsia="Proxima Nova" w:hAnsi="Proxima Nova" w:cs="Proxima Nova"/>
-          <w:sz w:val="24"/>
-          <w:szCs w:val="24"/>
-        </w:rPr>
-        <w:t>SQLDatabaseToolkit</w:t>
-      </w:r>
-      <w:proofErr w:type="spellEnd"/>
-      <w:r>
-        <w:rPr>
-          <w:rFonts w:ascii="Proxima Nova" w:eastAsia="Proxima Nova" w:hAnsi="Proxima Nova" w:cs="Proxima Nova"/>
-          <w:sz w:val="24"/>
-          <w:szCs w:val="24"/>
-        </w:rPr>
-        <w:t xml:space="preserve"> and various prompt templates to build </w:t>
-      </w:r>
-      <w:proofErr w:type="spellStart"/>
-      <w:r>
-        <w:rPr>
-          <w:rFonts w:ascii="Proxima Nova" w:eastAsia="Proxima Nova" w:hAnsi="Proxima Nova" w:cs="Proxima Nova"/>
-          <w:sz w:val="24"/>
-          <w:szCs w:val="24"/>
-        </w:rPr>
-        <w:t>sql</w:t>
-      </w:r>
-      <w:proofErr w:type="spellEnd"/>
-      <w:r>
-        <w:rPr>
-          <w:rFonts w:ascii="Proxima Nova" w:eastAsia="Proxima Nova" w:hAnsi="Proxima Nova" w:cs="Proxima Nova"/>
-          <w:sz w:val="24"/>
-          <w:szCs w:val="24"/>
-        </w:rPr>
-        <w:t xml:space="preserve"> queries and fetch relevant data from the LLM</w:t>
-      </w:r>
-    </w:p>
-    <w:p>
-      <w:pPr>
-        <w:numPr>
-          <w:ilvl w:val="0"/>
-          <w:numId w:val="7"/>
-        </w:numPr>
-        <w:rPr>
-          <w:rFonts w:ascii="Nunito" w:eastAsia="Nunito" w:hAnsi="Nunito" w:cs="Nunito"/>
-          <w:sz w:val="24"/>
-          <w:szCs w:val="24"/>
-        </w:rPr>
-      </w:pPr>
-      <w:r>
-        <w:rPr>
-          <w:rFonts w:ascii="Proxima Nova" w:eastAsia="Proxima Nova" w:hAnsi="Proxima Nova" w:cs="Proxima Nova"/>
-          <w:b/>
-          <w:bCs/>
-          <w:sz w:val="24"/>
-          <w:szCs w:val="24"/>
-        </w:rPr>
-        <w:lastRenderedPageBreak/>
-        <w:t>Chat application</w:t>
-      </w:r>
-      <w:r>
-        <w:rPr>
-          <w:rFonts w:ascii="Proxima Nova" w:eastAsia="Proxima Nova" w:hAnsi="Proxima Nova" w:cs="Proxima Nova"/>
-          <w:sz w:val="24"/>
-          <w:szCs w:val="24"/>
-        </w:rPr>
-        <w:t xml:space="preserve"> - Develop the chat application using </w:t>
-      </w:r>
-      <w:proofErr w:type="spellStart"/>
-      <w:r>
-        <w:rPr>
-          <w:rFonts w:ascii="Proxima Nova" w:eastAsia="Proxima Nova" w:hAnsi="Proxima Nova" w:cs="Proxima Nova"/>
-          <w:sz w:val="24"/>
-          <w:szCs w:val="24"/>
-        </w:rPr>
-        <w:t>streamlit</w:t>
-      </w:r>
-      <w:proofErr w:type="spellEnd"/>
-      <w:r>
-        <w:rPr>
-          <w:rFonts w:ascii="Proxima Nova" w:eastAsia="Proxima Nova" w:hAnsi="Proxima Nova" w:cs="Proxima Nova"/>
-          <w:sz w:val="24"/>
-          <w:szCs w:val="24"/>
-        </w:rPr>
-        <w:t xml:space="preserve"> in python and build the capability to retain conversation memory.</w:t>
-      </w:r>
-    </w:p>
-    <w:p>
-      <w:pPr>
-        <w:numPr>
-          <w:ilvl w:val="0"/>
-          <w:numId w:val="7"/>
-        </w:numPr>
-        <w:rPr>
-          <w:rFonts w:ascii="Nunito" w:eastAsia="Nunito" w:hAnsi="Nunito" w:cs="Nunito"/>
-          <w:sz w:val="24"/>
-          <w:szCs w:val="24"/>
-        </w:rPr>
-      </w:pPr>
-      <w:r>
-        <w:rPr>
-          <w:rFonts w:ascii="Proxima Nova" w:eastAsia="Proxima Nova" w:hAnsi="Proxima Nova" w:cs="Proxima Nova"/>
-          <w:b/>
-          <w:bCs/>
-          <w:sz w:val="24"/>
-          <w:szCs w:val="24"/>
-        </w:rPr>
-        <w:t>Dashboard integration</w:t>
-      </w:r>
-      <w:r>
-        <w:rPr>
-          <w:rFonts w:ascii="Proxima Nova" w:eastAsia="Proxima Nova" w:hAnsi="Proxima Nova" w:cs="Proxima Nova"/>
-          <w:sz w:val="24"/>
-          <w:szCs w:val="24"/>
-        </w:rPr>
-        <w:t xml:space="preserve"> - Create graphs and charts in the </w:t>
-      </w:r>
-      <w:proofErr w:type="spellStart"/>
-      <w:r>
-        <w:rPr>
-          <w:rFonts w:ascii="Proxima Nova" w:eastAsia="Proxima Nova" w:hAnsi="Proxima Nova" w:cs="Proxima Nova"/>
-          <w:sz w:val="24"/>
-          <w:szCs w:val="24"/>
-        </w:rPr>
-        <w:t>streamlit</w:t>
-      </w:r>
-      <w:proofErr w:type="spellEnd"/>
-      <w:r>
-        <w:rPr>
-          <w:rFonts w:ascii="Proxima Nova" w:eastAsia="Proxima Nova" w:hAnsi="Proxima Nova" w:cs="Proxima Nova"/>
-          <w:sz w:val="24"/>
-          <w:szCs w:val="24"/>
-        </w:rPr>
-        <w:t xml:space="preserve"> application based on the data provided.</w:t>
-      </w:r>
-    </w:p>
-    <w:p>
-      <w:pPr>
-        <w:pStyle w:val="Heading1"/>
-        <w:rPr>
-          <w:rFonts w:ascii="Proxima Nova" w:eastAsia="Proxima Nova" w:hAnsi="Proxima Nova" w:cs="Proxima Nova"/>
-          <w:b/>
-          <w:bCs/>
-        </w:rPr>
-      </w:pPr>
-      <w:bookmarkStart w:id="15" w:name="_heading=h.qi96d73tzt6n" w:colFirst="0" w:colLast="0"/>
-      <w:bookmarkEnd w:id="15"/>
-    </w:p>
-    <w:p>
-      <w:pPr>
-        <w:pStyle w:val="Heading1"/>
-        <w:rPr>
-          <w:rFonts w:ascii="Proxima Nova" w:eastAsia="Proxima Nova" w:hAnsi="Proxima Nova" w:cs="Proxima Nova"/>
-          <w:b/>
-          <w:bCs/>
-        </w:rPr>
-      </w:pPr>
-      <w:bookmarkStart w:id="16" w:name="_heading=h.qgu0wlmxod4x" w:colFirst="0" w:colLast="0"/>
-      <w:bookmarkEnd w:id="16"/>
+      <w:bookmarkStart w:id="5" w:name="_heading=h.qgu0wlmxod4x" w:colFirst="0" w:colLast="0"/>
+      <w:bookmarkEnd w:id="5"/>
       <w:r>
         <w:rPr>
           <w:rFonts w:ascii="Proxima Nova" w:eastAsia="Proxima Nova" w:hAnsi="Proxima Nova" w:cs="Proxima Nova"/>
@@ -3148,169 +955,16 @@
         <w:pStyle w:val="Heading2"/>
         <w:rPr>
           <w:rFonts w:ascii="Proxima Nova" w:eastAsia="Proxima Nova" w:hAnsi="Proxima Nova" w:cs="Proxima Nova"/>
-          <w:sz w:val="24"/>
-          <w:szCs w:val="24"/>
-        </w:rPr>
-      </w:pPr>
-      <w:bookmarkStart w:id="17" w:name="_heading=h.i13k1al9pkfg" w:colFirst="0" w:colLast="0"/>
-      <w:bookmarkEnd w:id="17"/>
-    </w:p>
-    <w:p>
-      <w:pPr>
-        <w:rPr>
-          <w:rFonts w:ascii="Proxima Nova" w:eastAsia="Proxima Nova" w:hAnsi="Proxima Nova" w:cs="Proxima Nova"/>
-        </w:rPr>
-      </w:pPr>
-    </w:p>
-    <w:p>
-      <w:pPr>
-        <w:pStyle w:val="Heading1"/>
-        <w:rPr>
-          <w:rFonts w:ascii="Proxima Nova" w:eastAsia="Proxima Nova" w:hAnsi="Proxima Nova" w:cs="Proxima Nova"/>
-          <w:b/>
-          <w:bCs/>
-        </w:rPr>
-      </w:pPr>
-      <w:bookmarkStart w:id="18" w:name="_heading=h.dx7x5n6m76aa" w:colFirst="0" w:colLast="0"/>
-      <w:bookmarkEnd w:id="18"/>
-      <w:r>
-        <w:rPr>
-          <w:rFonts w:ascii="Proxima Nova" w:eastAsia="Proxima Nova" w:hAnsi="Proxima Nova" w:cs="Proxima Nova"/>
-          <w:b/>
-          <w:bCs/>
-        </w:rPr>
-        <w:t>Future Directions</w:t>
-      </w:r>
-    </w:p>
-    <w:p>
-      <w:pPr>
-        <w:numPr>
-          <w:ilvl w:val="0"/>
-          <w:numId w:val="3"/>
-        </w:numPr>
-        <w:spacing w:after="200"/>
-        <w:rPr>
-          <w:rFonts w:ascii="Proxima Nova" w:eastAsia="Proxima Nova" w:hAnsi="Proxima Nova" w:cs="Proxima Nova"/>
-          <w:sz w:val="24"/>
-          <w:szCs w:val="24"/>
-        </w:rPr>
-      </w:pPr>
-      <w:r>
-        <w:rPr>
-          <w:rFonts w:ascii="Proxima Nova" w:eastAsia="Proxima Nova" w:hAnsi="Proxima Nova" w:cs="Proxima Nova"/>
-          <w:sz w:val="24"/>
-          <w:szCs w:val="24"/>
-        </w:rPr>
-        <w:t xml:space="preserve">Connecting to other databases such as </w:t>
-      </w:r>
-      <w:r>
-        <w:rPr>
-          <w:rFonts w:ascii="Proxima Nova" w:eastAsia="Proxima Nova" w:hAnsi="Proxima Nova" w:cs="Proxima Nova"/>
-          <w:b/>
-          <w:bCs/>
-          <w:sz w:val="24"/>
-          <w:szCs w:val="24"/>
-        </w:rPr>
-        <w:t>MongoDB, Spark</w:t>
-      </w:r>
-    </w:p>
-    <w:p>
-      <w:pPr>
-        <w:numPr>
-          <w:ilvl w:val="0"/>
-          <w:numId w:val="3"/>
-        </w:numPr>
-        <w:spacing w:after="200"/>
-        <w:rPr>
-          <w:rFonts w:ascii="Proxima Nova" w:eastAsia="Proxima Nova" w:hAnsi="Proxima Nova" w:cs="Proxima Nova"/>
-          <w:sz w:val="24"/>
-          <w:szCs w:val="24"/>
-        </w:rPr>
-      </w:pPr>
-      <w:r>
-        <w:rPr>
-          <w:rFonts w:ascii="Proxima Nova" w:eastAsia="Proxima Nova" w:hAnsi="Proxima Nova" w:cs="Proxima Nova"/>
-          <w:sz w:val="24"/>
-          <w:szCs w:val="24"/>
-        </w:rPr>
-        <w:t xml:space="preserve">Deployment of insights as a </w:t>
-      </w:r>
-      <w:proofErr w:type="spellStart"/>
-      <w:r>
-        <w:rPr>
-          <w:rFonts w:ascii="Proxima Nova" w:eastAsia="Proxima Nova" w:hAnsi="Proxima Nova" w:cs="Proxima Nova"/>
-          <w:sz w:val="24"/>
-          <w:szCs w:val="24"/>
-        </w:rPr>
-        <w:t>cron</w:t>
-      </w:r>
-      <w:proofErr w:type="spellEnd"/>
-      <w:r>
-        <w:rPr>
-          <w:rFonts w:ascii="Proxima Nova" w:eastAsia="Proxima Nova" w:hAnsi="Proxima Nova" w:cs="Proxima Nova"/>
-          <w:sz w:val="24"/>
-          <w:szCs w:val="24"/>
-        </w:rPr>
-        <w:t>/scheduled process</w:t>
-      </w:r>
-    </w:p>
-    <w:p>
-      <w:pPr>
-        <w:numPr>
-          <w:ilvl w:val="0"/>
-          <w:numId w:val="3"/>
-        </w:numPr>
-        <w:spacing w:after="200"/>
-        <w:rPr>
-          <w:rFonts w:ascii="Proxima Nova" w:eastAsia="Proxima Nova" w:hAnsi="Proxima Nova" w:cs="Proxima Nova"/>
-          <w:sz w:val="24"/>
-          <w:szCs w:val="24"/>
-        </w:rPr>
-      </w:pPr>
-      <w:r>
-        <w:rPr>
-          <w:rFonts w:ascii="Proxima Nova" w:eastAsia="Proxima Nova" w:hAnsi="Proxima Nova" w:cs="Proxima Nova"/>
-          <w:sz w:val="24"/>
-          <w:szCs w:val="24"/>
-        </w:rPr>
-        <w:t xml:space="preserve">Export of insights/queries to </w:t>
-      </w:r>
-      <w:proofErr w:type="spellStart"/>
-      <w:r>
-        <w:rPr>
-          <w:rFonts w:ascii="Proxima Nova" w:eastAsia="Proxima Nova" w:hAnsi="Proxima Nova" w:cs="Proxima Nova"/>
-          <w:b/>
-          <w:bCs/>
-          <w:sz w:val="24"/>
-          <w:szCs w:val="24"/>
-        </w:rPr>
-        <w:t>PowerBI</w:t>
-      </w:r>
-      <w:proofErr w:type="spellEnd"/>
-      <w:r>
-        <w:rPr>
-          <w:rFonts w:ascii="Proxima Nova" w:eastAsia="Proxima Nova" w:hAnsi="Proxima Nova" w:cs="Proxima Nova"/>
-          <w:b/>
-          <w:bCs/>
-          <w:sz w:val="24"/>
-          <w:szCs w:val="24"/>
-        </w:rPr>
-        <w:t>/Tableau/GDS</w:t>
-      </w:r>
-    </w:p>
-    <w:p>
-      <w:pPr>
-        <w:pStyle w:val="Heading2"/>
-        <w:rPr>
-          <w:rFonts w:ascii="Proxima Nova" w:eastAsia="Proxima Nova" w:hAnsi="Proxima Nova" w:cs="Proxima Nova"/>
           <w:b/>
           <w:bCs/>
           <w:sz w:val="36"/>
           <w:szCs w:val="36"/>
         </w:rPr>
       </w:pPr>
-      <w:bookmarkStart w:id="19" w:name="_heading=h.cbica81bntg1" w:colFirst="0" w:colLast="0"/>
-      <w:bookmarkEnd w:id="19"/>
+      <w:bookmarkStart w:id="6" w:name="_heading=h.i13k1al9pkfg" w:colFirst="0" w:colLast="0"/>
+      <w:bookmarkStart w:id="7" w:name="_heading=h.cbica81bntg1" w:colFirst="0" w:colLast="0"/>
+      <w:bookmarkEnd w:id="6"/>
+      <w:bookmarkEnd w:id="7"/>
     </w:p>
     <w:p>
       <w:pPr>
@@ -3321,8 +975,8 @@
           <w:bCs/>
         </w:rPr>
       </w:pPr>
-      <w:bookmarkStart w:id="20" w:name="_heading=h.xvczaxabqu6x" w:colFirst="0" w:colLast="0"/>
-      <w:bookmarkEnd w:id="20"/>
+      <w:bookmarkStart w:id="8" w:name="_heading=h.xvczaxabqu6x" w:colFirst="0" w:colLast="0"/>
+      <w:bookmarkEnd w:id="8"/>
       <w:r>
         <w:rPr>
           <w:rFonts w:ascii="Proxima Nova" w:eastAsia="Proxima Nova" w:hAnsi="Proxima Nova" w:cs="Proxima Nova"/>
@@ -3450,7 +1104,6 @@
           <w:sz w:val="24"/>
           <w:szCs w:val="24"/>
         </w:rPr>
-        <w:lastRenderedPageBreak/>
         <w:t xml:space="preserve">Ans: </w:t>
       </w:r>
       <w:r>
@@ -4012,7 +1665,6 @@
           <w:sz w:val="24"/>
           <w:szCs w:val="24"/>
         </w:rPr>
-        <w:lastRenderedPageBreak/>
         <w:t>Ans:</w:t>
       </w:r>
     </w:p>
@@ -4065,142 +1717,9 @@
         </w:rPr>
       </w:pPr>
     </w:p>
-    <w:p>
-      <w:pPr>
-        <w:rPr>
-          <w:rFonts w:ascii="Proxima Nova" w:eastAsia="Proxima Nova" w:hAnsi="Proxima Nova" w:cs="Proxima Nova"/>
-        </w:rPr>
-      </w:pPr>
-    </w:p>
-    <w:p>
-      <w:pPr>
-        <w:rPr>
-          <w:rFonts w:ascii="Proxima Nova" w:eastAsia="Proxima Nova" w:hAnsi="Proxima Nova" w:cs="Proxima Nova"/>
-        </w:rPr>
-      </w:pPr>
-    </w:p>
-    <w:p>
-      <w:pPr>
-        <w:rPr>
-          <w:rFonts w:ascii="Proxima Nova" w:eastAsia="Proxima Nova" w:hAnsi="Proxima Nova" w:cs="Proxima Nova"/>
-        </w:rPr>
-      </w:pPr>
-    </w:p>
-    <w:p>
-      <w:pPr>
-        <w:rPr>
-          <w:rFonts w:ascii="Proxima Nova" w:eastAsia="Proxima Nova" w:hAnsi="Proxima Nova" w:cs="Proxima Nova"/>
-          <w:b/>
-          <w:bCs/>
-          <w:sz w:val="66"/>
-          <w:szCs w:val="66"/>
-        </w:rPr>
-      </w:pPr>
-      <w:r>
-        <w:rPr>
-          <w:rFonts w:ascii="Proxima Nova" w:eastAsia="Proxima Nova" w:hAnsi="Proxima Nova" w:cs="Proxima Nova"/>
-          <w:b/>
-          <w:bCs/>
-          <w:sz w:val="66"/>
-          <w:szCs w:val="66"/>
-        </w:rPr>
-        <w:t>TWO IMPLEMENTATIONS</w:t>
-      </w:r>
-    </w:p>
-    <w:p>
-      <w:pPr>
-        <w:numPr>
-          <w:ilvl w:val="0"/>
-          <w:numId w:val="1"/>
-        </w:numPr>
-        <w:rPr>
-          <w:rFonts w:ascii="Proxima Nova" w:eastAsia="Proxima Nova" w:hAnsi="Proxima Nova" w:cs="Proxima Nova"/>
-          <w:b/>
-          <w:bCs/>
-          <w:color w:val="FF0000"/>
-          <w:sz w:val="66"/>
-          <w:szCs w:val="66"/>
-        </w:rPr>
-      </w:pPr>
-      <w:r>
-        <w:rPr>
-          <w:rFonts w:ascii="Proxima Nova" w:eastAsia="Proxima Nova" w:hAnsi="Proxima Nova" w:cs="Proxima Nova"/>
-          <w:b/>
-          <w:bCs/>
-          <w:color w:val="FF0000"/>
-          <w:sz w:val="66"/>
-          <w:szCs w:val="66"/>
-        </w:rPr>
-        <w:t>LOCAL (COMPUTER)*** (Local MySQL - Windows, Mac, Linux)</w:t>
-      </w:r>
-    </w:p>
-    <w:p>
-      <w:pPr>
-        <w:ind w:left="720"/>
-        <w:rPr>
-          <w:rFonts w:ascii="Proxima Nova" w:eastAsia="Proxima Nova" w:hAnsi="Proxima Nova" w:cs="Proxima Nova"/>
-          <w:b/>
-          <w:bCs/>
-          <w:color w:val="FF0000"/>
-          <w:sz w:val="66"/>
-          <w:szCs w:val="66"/>
-        </w:rPr>
-      </w:pPr>
-    </w:p>
-    <w:p>
-      <w:pPr>
-        <w:numPr>
-          <w:ilvl w:val="0"/>
-          <w:numId w:val="1"/>
-        </w:numPr>
-        <w:rPr>
-          <w:rFonts w:ascii="Proxima Nova" w:eastAsia="Proxima Nova" w:hAnsi="Proxima Nova" w:cs="Proxima Nova"/>
-          <w:b/>
-          <w:bCs/>
-          <w:color w:val="188038"/>
-          <w:sz w:val="66"/>
-          <w:szCs w:val="66"/>
-        </w:rPr>
-      </w:pPr>
-      <w:r>
-        <w:rPr>
-          <w:rFonts w:ascii="Proxima Nova" w:eastAsia="Proxima Nova" w:hAnsi="Proxima Nova" w:cs="Proxima Nova"/>
-          <w:b/>
-          <w:bCs/>
-          <w:color w:val="188038"/>
-          <w:sz w:val="66"/>
-          <w:szCs w:val="66"/>
-        </w:rPr>
-        <w:t xml:space="preserve">REMOTE (MySQL remote, </w:t>
-      </w:r>
-      <w:proofErr w:type="spellStart"/>
-      <w:r>
-        <w:rPr>
-          <w:rFonts w:ascii="Proxima Nova" w:eastAsia="Proxima Nova" w:hAnsi="Proxima Nova" w:cs="Proxima Nova"/>
-          <w:b/>
-          <w:bCs/>
-          <w:color w:val="188038"/>
-          <w:sz w:val="66"/>
-          <w:szCs w:val="66"/>
-        </w:rPr>
-        <w:t>Streamlit</w:t>
-      </w:r>
-      <w:proofErr w:type="spellEnd"/>
-      <w:r>
-        <w:rPr>
-          <w:rFonts w:ascii="Proxima Nova" w:eastAsia="Proxima Nova" w:hAnsi="Proxima Nova" w:cs="Proxima Nova"/>
-          <w:b/>
-          <w:bCs/>
-          <w:color w:val="188038"/>
-          <w:sz w:val="66"/>
-          <w:szCs w:val="66"/>
-        </w:rPr>
-        <w:t xml:space="preserve"> FE -&gt; URL)</w:t>
-      </w:r>
-    </w:p>
     <w:sectPr>
-      <w:headerReference w:type="default" r:id="rId30"/>
-      <w:footerReference w:type="default" r:id="rId31"/>
+      <w:headerReference w:type="default" r:id="rId13"/>
+      <w:footerReference w:type="default" r:id="rId14"/>
       <w:pgSz w:w="11906" w:h="16838"/>
       <w:pgMar w:top="1440" w:right="1440" w:bottom="1440" w:left="1440" w:header="720" w:footer="720" w:gutter="0"/>
       <w:pgNumType w:start="1"/>

</xml_diff>